<commit_message>
parte 2 do trabalho (falta 1 gráfico e as justificativas de cada
</commit_message>
<xml_diff>
--- a/relatorio.docx
+++ b/relatorio.docx
@@ -60,16 +60,16 @@
         <w:rPr>
           <w:b w:val="0"/>
           <w:bCs w:val="0"/>
-          <w:sz w:val="28"/>
-          <w:szCs w:val="28"/>
-        </w:rPr>
-      </w:pPr>
-      <w:r>
-        <w:rPr>
-          <w:b w:val="0"/>
-          <w:bCs w:val="0"/>
-          <w:sz w:val="28"/>
-          <w:szCs w:val="28"/>
+          <w:sz w:val="24"/>
+          <w:szCs w:val="24"/>
+        </w:rPr>
+      </w:pPr>
+      <w:r>
+        <w:rPr>
+          <w:b w:val="0"/>
+          <w:bCs w:val="0"/>
+          <w:sz w:val="24"/>
+          <w:szCs w:val="24"/>
         </w:rPr>
         <w:t>dificuldades durante a normalização e merge dos dados:</w:t>
       </w:r>
@@ -78,43 +78,211 @@
       <w:pPr>
         <w:pStyle w:val="Normal"/>
         <w:jc w:val="both"/>
-      </w:pPr>
-      <w:r>
-        <w:rPr>
-          <w:b w:val="0"/>
-          <w:bCs w:val="0"/>
-          <w:sz w:val="28"/>
-          <w:szCs w:val="28"/>
+        <w:rPr>
+          <w:b w:val="0"/>
+          <w:bCs w:val="0"/>
+          <w:sz w:val="24"/>
+          <w:szCs w:val="24"/>
+        </w:rPr>
+      </w:pPr>
+      <w:r>
+        <w:rPr>
+          <w:b w:val="0"/>
+          <w:bCs w:val="0"/>
+          <w:sz w:val="24"/>
+          <w:szCs w:val="24"/>
+        </w:rPr>
+        <w:t>A normalização de nomes foi feita como u</w:t>
+      </w:r>
+      <w:r>
+        <w:rPr>
+          <w:b w:val="0"/>
+          <w:bCs w:val="0"/>
+          <w:sz w:val="24"/>
+          <w:szCs w:val="24"/>
+        </w:rPr>
+        <w:t>ma função</w:t>
+      </w:r>
+      <w:r>
+        <w:rPr>
+          <w:b w:val="0"/>
+          <w:bCs w:val="0"/>
+          <w:sz w:val="24"/>
+          <w:szCs w:val="24"/>
+        </w:rPr>
+        <w:t>, que serve para c</w:t>
+      </w:r>
+      <w:r>
+        <w:rPr>
+          <w:rFonts w:ascii="Aptos" w:hAnsi="Aptos" w:eastAsia="Aptos" w:cs="Aptos"/>
+          <w:noProof w:val="0"/>
+          <w:sz w:val="24"/>
+          <w:szCs w:val="24"/>
+          <w:lang w:val="pt-BR"/>
+        </w:rPr>
+        <w:t xml:space="preserve">onverter para minúsculas, remover espaços </w:t>
+      </w:r>
+      <w:r>
+        <w:rPr>
+          <w:rFonts w:ascii="Aptos" w:hAnsi="Aptos" w:eastAsia="Aptos" w:cs="Aptos"/>
+          <w:noProof w:val="0"/>
+          <w:sz w:val="24"/>
+          <w:szCs w:val="24"/>
+          <w:lang w:val="pt-BR"/>
+        </w:rPr>
+        <w:t xml:space="preserve">extras </w:t>
+      </w:r>
+      <w:r>
+        <w:rPr>
+          <w:rFonts w:ascii="Aptos" w:hAnsi="Aptos" w:eastAsia="Aptos" w:cs="Aptos"/>
+          <w:noProof w:val="0"/>
+          <w:sz w:val="24"/>
+          <w:szCs w:val="24"/>
+          <w:lang w:val="pt-BR"/>
+        </w:rPr>
+        <w:t xml:space="preserve">e </w:t>
+      </w:r>
+      <w:r>
+        <w:rPr>
+          <w:rFonts w:ascii="Aptos" w:hAnsi="Aptos" w:eastAsia="Aptos" w:cs="Aptos"/>
+          <w:noProof w:val="0"/>
+          <w:sz w:val="24"/>
+          <w:szCs w:val="24"/>
+          <w:lang w:val="pt-BR"/>
+        </w:rPr>
+        <w:t>remover</w:t>
+      </w:r>
+      <w:r>
+        <w:rPr>
+          <w:rFonts w:ascii="Aptos" w:hAnsi="Aptos" w:eastAsia="Aptos" w:cs="Aptos"/>
+          <w:noProof w:val="0"/>
+          <w:sz w:val="24"/>
+          <w:szCs w:val="24"/>
+          <w:lang w:val="pt-BR"/>
         </w:rPr>
         <w:t xml:space="preserve"> </w:t>
       </w:r>
-    </w:p>
-    <w:p>
-      <w:pPr>
-        <w:pStyle w:val="Normal"/>
-        <w:jc w:val="both"/>
-      </w:pPr>
-      <w:r>
-        <w:rPr>
-          <w:b w:val="0"/>
-          <w:bCs w:val="0"/>
-          <w:sz w:val="28"/>
-          <w:szCs w:val="28"/>
-        </w:rPr>
-        <w:t>foram encontrados jogadores com nomes iguais e até mesmo que jogam no mesmo time, como é o exemplo dos "Carlos Eduardos", que jogam no mirassol. Como também os "Matheusinhos" do Vitória</w:t>
-      </w:r>
-    </w:p>
-    <w:p>
-      <w:pPr>
-        <w:pStyle w:val="Normal"/>
-        <w:jc w:val="both"/>
-      </w:pPr>
-      <w:r>
-        <w:rPr>
-          <w:b w:val="0"/>
-          <w:bCs w:val="0"/>
-          <w:sz w:val="28"/>
-          <w:szCs w:val="28"/>
+      <w:r>
+        <w:rPr>
+          <w:rFonts w:ascii="Aptos" w:hAnsi="Aptos" w:eastAsia="Aptos" w:cs="Aptos"/>
+          <w:noProof w:val="0"/>
+          <w:sz w:val="24"/>
+          <w:szCs w:val="24"/>
+          <w:lang w:val="pt-BR"/>
+        </w:rPr>
+        <w:t>acentos.</w:t>
+      </w:r>
+    </w:p>
+    <w:p>
+      <w:pPr>
+        <w:pStyle w:val="Normal"/>
+        <w:jc w:val="both"/>
+        <w:rPr>
+          <w:b w:val="0"/>
+          <w:bCs w:val="0"/>
+          <w:sz w:val="24"/>
+          <w:szCs w:val="24"/>
+        </w:rPr>
+      </w:pPr>
+      <w:r>
+        <w:rPr>
+          <w:b w:val="0"/>
+          <w:bCs w:val="0"/>
+          <w:sz w:val="24"/>
+          <w:szCs w:val="24"/>
+        </w:rPr>
+        <w:t>F</w:t>
+      </w:r>
+      <w:r>
+        <w:rPr>
+          <w:b w:val="0"/>
+          <w:bCs w:val="0"/>
+          <w:sz w:val="24"/>
+          <w:szCs w:val="24"/>
+        </w:rPr>
+        <w:t xml:space="preserve">oram encontrados jogadores com nomes iguais e até mesmo que jogam no mesmo time, como é o exemplo dos "Carlos </w:t>
+      </w:r>
+      <w:r>
+        <w:rPr>
+          <w:b w:val="0"/>
+          <w:bCs w:val="0"/>
+          <w:sz w:val="24"/>
+          <w:szCs w:val="24"/>
+        </w:rPr>
+        <w:t>Eduardos</w:t>
+      </w:r>
+      <w:r>
+        <w:rPr>
+          <w:b w:val="0"/>
+          <w:bCs w:val="0"/>
+          <w:sz w:val="24"/>
+          <w:szCs w:val="24"/>
+        </w:rPr>
+        <w:t xml:space="preserve">", que jogam no </w:t>
+      </w:r>
+      <w:r>
+        <w:rPr>
+          <w:b w:val="0"/>
+          <w:bCs w:val="0"/>
+          <w:sz w:val="24"/>
+          <w:szCs w:val="24"/>
+        </w:rPr>
+        <w:t>Mirassol</w:t>
+      </w:r>
+      <w:r>
+        <w:rPr>
+          <w:b w:val="0"/>
+          <w:bCs w:val="0"/>
+          <w:sz w:val="24"/>
+          <w:szCs w:val="24"/>
+        </w:rPr>
+        <w:t>. Como também os "</w:t>
+      </w:r>
+      <w:r>
+        <w:rPr>
+          <w:b w:val="0"/>
+          <w:bCs w:val="0"/>
+          <w:sz w:val="24"/>
+          <w:szCs w:val="24"/>
+        </w:rPr>
+        <w:t>Matheusinhos</w:t>
+      </w:r>
+      <w:r>
+        <w:rPr>
+          <w:b w:val="0"/>
+          <w:bCs w:val="0"/>
+          <w:sz w:val="24"/>
+          <w:szCs w:val="24"/>
+        </w:rPr>
+        <w:t>" do Vitória</w:t>
+      </w:r>
+      <w:r>
+        <w:rPr>
+          <w:b w:val="0"/>
+          <w:bCs w:val="0"/>
+          <w:sz w:val="24"/>
+          <w:szCs w:val="24"/>
+        </w:rPr>
+        <w:t>.</w:t>
+      </w:r>
+    </w:p>
+    <w:p>
+      <w:pPr>
+        <w:pStyle w:val="Normal"/>
+        <w:jc w:val="both"/>
+        <w:rPr>
+          <w:b w:val="0"/>
+          <w:bCs w:val="0"/>
+          <w:sz w:val="24"/>
+          <w:szCs w:val="24"/>
+        </w:rPr>
+      </w:pPr>
+      <w:r>
+        <w:rPr>
+          <w:b w:val="0"/>
+          <w:bCs w:val="0"/>
+          <w:sz w:val="24"/>
+          <w:szCs w:val="24"/>
         </w:rPr>
         <w:t>também foram encontradas linhas repetidas. Os "</w:t>
       </w:r>
@@ -122,8 +290,8 @@
         <w:rPr>
           <w:b w:val="0"/>
           <w:bCs w:val="0"/>
-          <w:sz w:val="28"/>
-          <w:szCs w:val="28"/>
+          <w:sz w:val="24"/>
+          <w:szCs w:val="24"/>
         </w:rPr>
         <w:t>Mateusinhos</w:t>
       </w:r>
@@ -131,8 +299,8 @@
         <w:rPr>
           <w:b w:val="0"/>
           <w:bCs w:val="0"/>
-          <w:sz w:val="28"/>
-          <w:szCs w:val="28"/>
+          <w:sz w:val="24"/>
+          <w:szCs w:val="24"/>
         </w:rPr>
         <w:t xml:space="preserve">" do Vitória e os "Carlos </w:t>
       </w:r>
@@ -140,8 +308,8 @@
         <w:rPr>
           <w:b w:val="0"/>
           <w:bCs w:val="0"/>
-          <w:sz w:val="28"/>
-          <w:szCs w:val="28"/>
+          <w:sz w:val="24"/>
+          <w:szCs w:val="24"/>
         </w:rPr>
         <w:t>Eduardos</w:t>
       </w:r>
@@ -149,8 +317,8 @@
         <w:rPr>
           <w:b w:val="0"/>
           <w:bCs w:val="0"/>
-          <w:sz w:val="28"/>
-          <w:szCs w:val="28"/>
+          <w:sz w:val="24"/>
+          <w:szCs w:val="24"/>
         </w:rPr>
         <w:t>" do Mirassol tiveram registros repetidos 8x cada, gerando uma repetição de 16</w:t>
       </w:r>
@@ -158,8 +326,8 @@
         <w:rPr>
           <w:b w:val="0"/>
           <w:bCs w:val="0"/>
-          <w:sz w:val="28"/>
-          <w:szCs w:val="28"/>
+          <w:sz w:val="24"/>
+          <w:szCs w:val="24"/>
         </w:rPr>
         <w:t>x desses</w:t>
       </w:r>
@@ -167,8 +335,8 @@
         <w:rPr>
           <w:b w:val="0"/>
           <w:bCs w:val="0"/>
-          <w:sz w:val="28"/>
-          <w:szCs w:val="28"/>
+          <w:sz w:val="24"/>
+          <w:szCs w:val="24"/>
         </w:rPr>
         <w:t xml:space="preserve"> nomes, como mostrado na tabela:</w:t>
       </w:r>
@@ -177,463 +345,769 @@
       <w:pPr>
         <w:pStyle w:val="Normal"/>
         <w:jc w:val="both"/>
-      </w:pPr>
-      <w:r>
-        <w:rPr>
-          <w:b w:val="0"/>
-          <w:bCs w:val="0"/>
-          <w:sz w:val="28"/>
-          <w:szCs w:val="28"/>
+        <w:rPr>
+          <w:b w:val="0"/>
+          <w:bCs w:val="0"/>
+          <w:sz w:val="24"/>
+          <w:szCs w:val="24"/>
+        </w:rPr>
+      </w:pPr>
+      <w:r>
+        <w:rPr>
+          <w:b w:val="0"/>
+          <w:bCs w:val="0"/>
+          <w:sz w:val="24"/>
+          <w:szCs w:val="24"/>
         </w:rPr>
         <w:t>Player</w:t>
       </w:r>
     </w:p>
     <w:p>
       <w:pPr>
-        <w:pStyle w:val="Normal"/>
-        <w:jc w:val="both"/>
-      </w:pPr>
-      <w:r>
-        <w:rPr>
-          <w:b w:val="0"/>
-          <w:bCs w:val="0"/>
-          <w:sz w:val="28"/>
-          <w:szCs w:val="28"/>
+        <w:pStyle w:val="ListParagraph"/>
+        <w:numPr>
+          <w:ilvl w:val="0"/>
+          <w:numId w:val="3"/>
+        </w:numPr>
+        <w:jc w:val="both"/>
+        <w:rPr>
+          <w:b w:val="0"/>
+          <w:bCs w:val="0"/>
+          <w:sz w:val="24"/>
+          <w:szCs w:val="24"/>
+        </w:rPr>
+      </w:pPr>
+      <w:r>
+        <w:rPr>
+          <w:b w:val="0"/>
+          <w:bCs w:val="0"/>
+          <w:sz w:val="24"/>
+          <w:szCs w:val="24"/>
         </w:rPr>
         <w:t>Matheusinho                16</w:t>
       </w:r>
     </w:p>
     <w:p>
       <w:pPr>
-        <w:pStyle w:val="Normal"/>
-        <w:jc w:val="both"/>
-      </w:pPr>
-      <w:r>
-        <w:rPr>
-          <w:b w:val="0"/>
-          <w:bCs w:val="0"/>
-          <w:sz w:val="28"/>
-          <w:szCs w:val="28"/>
+        <w:pStyle w:val="ListParagraph"/>
+        <w:numPr>
+          <w:ilvl w:val="0"/>
+          <w:numId w:val="3"/>
+        </w:numPr>
+        <w:jc w:val="both"/>
+        <w:rPr>
+          <w:b w:val="0"/>
+          <w:bCs w:val="0"/>
+          <w:sz w:val="24"/>
+          <w:szCs w:val="24"/>
+        </w:rPr>
+      </w:pPr>
+      <w:r>
+        <w:rPr>
+          <w:b w:val="0"/>
+          <w:bCs w:val="0"/>
+          <w:sz w:val="24"/>
+          <w:szCs w:val="24"/>
         </w:rPr>
         <w:t>Carlos Eduardo             16</w:t>
       </w:r>
     </w:p>
     <w:p>
       <w:pPr>
-        <w:pStyle w:val="Normal"/>
-        <w:jc w:val="both"/>
-      </w:pPr>
-      <w:r>
-        <w:rPr>
-          <w:b w:val="0"/>
-          <w:bCs w:val="0"/>
-          <w:sz w:val="28"/>
-          <w:szCs w:val="28"/>
+        <w:pStyle w:val="ListParagraph"/>
+        <w:numPr>
+          <w:ilvl w:val="0"/>
+          <w:numId w:val="3"/>
+        </w:numPr>
+        <w:jc w:val="both"/>
+        <w:rPr>
+          <w:b w:val="0"/>
+          <w:bCs w:val="0"/>
+          <w:sz w:val="24"/>
+          <w:szCs w:val="24"/>
+        </w:rPr>
+      </w:pPr>
+      <w:r>
+        <w:rPr>
+          <w:b w:val="0"/>
+          <w:bCs w:val="0"/>
+          <w:sz w:val="24"/>
+          <w:szCs w:val="24"/>
         </w:rPr>
         <w:t>Gabriel                     4</w:t>
       </w:r>
     </w:p>
     <w:p>
       <w:pPr>
-        <w:pStyle w:val="Normal"/>
-        <w:jc w:val="both"/>
-      </w:pPr>
-      <w:r>
-        <w:rPr>
-          <w:b w:val="0"/>
-          <w:bCs w:val="0"/>
-          <w:sz w:val="28"/>
-          <w:szCs w:val="28"/>
+        <w:pStyle w:val="ListParagraph"/>
+        <w:numPr>
+          <w:ilvl w:val="0"/>
+          <w:numId w:val="3"/>
+        </w:numPr>
+        <w:jc w:val="both"/>
+        <w:rPr>
+          <w:b w:val="0"/>
+          <w:bCs w:val="0"/>
+          <w:sz w:val="24"/>
+          <w:szCs w:val="24"/>
+        </w:rPr>
+      </w:pPr>
+      <w:r>
+        <w:rPr>
+          <w:b w:val="0"/>
+          <w:bCs w:val="0"/>
+          <w:sz w:val="24"/>
+          <w:szCs w:val="24"/>
         </w:rPr>
         <w:t>João Pedro                  3</w:t>
       </w:r>
     </w:p>
     <w:p>
       <w:pPr>
-        <w:pStyle w:val="Normal"/>
-        <w:jc w:val="both"/>
-      </w:pPr>
-      <w:r>
-        <w:rPr>
-          <w:b w:val="0"/>
-          <w:bCs w:val="0"/>
-          <w:sz w:val="28"/>
-          <w:szCs w:val="28"/>
+        <w:pStyle w:val="ListParagraph"/>
+        <w:numPr>
+          <w:ilvl w:val="0"/>
+          <w:numId w:val="3"/>
+        </w:numPr>
+        <w:jc w:val="both"/>
+        <w:rPr>
+          <w:b w:val="0"/>
+          <w:bCs w:val="0"/>
+          <w:sz w:val="24"/>
+          <w:szCs w:val="24"/>
+        </w:rPr>
+      </w:pPr>
+      <w:r>
+        <w:rPr>
+          <w:b w:val="0"/>
+          <w:bCs w:val="0"/>
+          <w:sz w:val="24"/>
+          <w:szCs w:val="24"/>
         </w:rPr>
         <w:t>Vitinho                     3</w:t>
       </w:r>
     </w:p>
     <w:p>
       <w:pPr>
-        <w:pStyle w:val="Normal"/>
-        <w:jc w:val="both"/>
-      </w:pPr>
-      <w:r>
-        <w:rPr>
-          <w:b w:val="0"/>
-          <w:bCs w:val="0"/>
-          <w:sz w:val="28"/>
-          <w:szCs w:val="28"/>
+        <w:pStyle w:val="ListParagraph"/>
+        <w:numPr>
+          <w:ilvl w:val="0"/>
+          <w:numId w:val="3"/>
+        </w:numPr>
+        <w:jc w:val="both"/>
+        <w:rPr>
+          <w:b w:val="0"/>
+          <w:bCs w:val="0"/>
+          <w:sz w:val="24"/>
+          <w:szCs w:val="24"/>
+        </w:rPr>
+      </w:pPr>
+      <w:r>
+        <w:rPr>
+          <w:b w:val="0"/>
+          <w:bCs w:val="0"/>
+          <w:sz w:val="24"/>
+          <w:szCs w:val="24"/>
         </w:rPr>
         <w:t>Dudu                        3</w:t>
       </w:r>
     </w:p>
     <w:p>
       <w:pPr>
-        <w:pStyle w:val="Normal"/>
-        <w:jc w:val="both"/>
-      </w:pPr>
-      <w:r>
-        <w:rPr>
-          <w:b w:val="0"/>
-          <w:bCs w:val="0"/>
-          <w:sz w:val="28"/>
-          <w:szCs w:val="28"/>
+        <w:pStyle w:val="ListParagraph"/>
+        <w:numPr>
+          <w:ilvl w:val="0"/>
+          <w:numId w:val="3"/>
+        </w:numPr>
+        <w:jc w:val="both"/>
+        <w:rPr>
+          <w:b w:val="0"/>
+          <w:bCs w:val="0"/>
+          <w:sz w:val="24"/>
+          <w:szCs w:val="24"/>
+        </w:rPr>
+      </w:pPr>
+      <w:r>
+        <w:rPr>
+          <w:b w:val="0"/>
+          <w:bCs w:val="0"/>
+          <w:sz w:val="24"/>
+          <w:szCs w:val="24"/>
         </w:rPr>
         <w:t>Allan                       3</w:t>
       </w:r>
     </w:p>
     <w:p>
       <w:pPr>
-        <w:pStyle w:val="Normal"/>
-        <w:jc w:val="both"/>
-      </w:pPr>
-      <w:r>
-        <w:rPr>
-          <w:b w:val="0"/>
-          <w:bCs w:val="0"/>
-          <w:sz w:val="28"/>
-          <w:szCs w:val="28"/>
+        <w:pStyle w:val="ListParagraph"/>
+        <w:numPr>
+          <w:ilvl w:val="0"/>
+          <w:numId w:val="3"/>
+        </w:numPr>
+        <w:jc w:val="both"/>
+        <w:rPr>
+          <w:b w:val="0"/>
+          <w:bCs w:val="0"/>
+          <w:sz w:val="24"/>
+          <w:szCs w:val="24"/>
+        </w:rPr>
+      </w:pPr>
+      <w:r>
+        <w:rPr>
+          <w:b w:val="0"/>
+          <w:bCs w:val="0"/>
+          <w:sz w:val="24"/>
+          <w:szCs w:val="24"/>
         </w:rPr>
         <w:t>Pascal Groß                 2</w:t>
       </w:r>
     </w:p>
     <w:p>
       <w:pPr>
-        <w:pStyle w:val="Normal"/>
-        <w:jc w:val="both"/>
-      </w:pPr>
-      <w:r>
-        <w:rPr>
-          <w:b w:val="0"/>
-          <w:bCs w:val="0"/>
-          <w:sz w:val="28"/>
-          <w:szCs w:val="28"/>
+        <w:pStyle w:val="ListParagraph"/>
+        <w:numPr>
+          <w:ilvl w:val="0"/>
+          <w:numId w:val="3"/>
+        </w:numPr>
+        <w:jc w:val="both"/>
+        <w:rPr>
+          <w:b w:val="0"/>
+          <w:bCs w:val="0"/>
+          <w:sz w:val="24"/>
+          <w:szCs w:val="24"/>
+        </w:rPr>
+      </w:pPr>
+      <w:r>
+        <w:rPr>
+          <w:b w:val="0"/>
+          <w:bCs w:val="0"/>
+          <w:sz w:val="24"/>
+          <w:szCs w:val="24"/>
         </w:rPr>
         <w:t>Brajan Gruda                2</w:t>
       </w:r>
     </w:p>
     <w:p>
       <w:pPr>
-        <w:pStyle w:val="Normal"/>
-        <w:jc w:val="both"/>
-      </w:pPr>
-      <w:r>
-        <w:rPr>
-          <w:b w:val="0"/>
-          <w:bCs w:val="0"/>
-          <w:sz w:val="28"/>
-          <w:szCs w:val="28"/>
+        <w:pStyle w:val="ListParagraph"/>
+        <w:numPr>
+          <w:ilvl w:val="0"/>
+          <w:numId w:val="3"/>
+        </w:numPr>
+        <w:jc w:val="both"/>
+        <w:rPr>
+          <w:b w:val="0"/>
+          <w:bCs w:val="0"/>
+          <w:sz w:val="24"/>
+          <w:szCs w:val="24"/>
+        </w:rPr>
+      </w:pPr>
+      <w:r>
+        <w:rPr>
+          <w:b w:val="0"/>
+          <w:bCs w:val="0"/>
+          <w:sz w:val="24"/>
+          <w:szCs w:val="24"/>
         </w:rPr>
         <w:t>Sandi Lovrić                2</w:t>
       </w:r>
     </w:p>
     <w:p>
       <w:pPr>
-        <w:pStyle w:val="Normal"/>
-        <w:jc w:val="both"/>
-      </w:pPr>
-      <w:r>
-        <w:rPr>
-          <w:b w:val="0"/>
-          <w:bCs w:val="0"/>
-          <w:sz w:val="28"/>
-          <w:szCs w:val="28"/>
+        <w:pStyle w:val="ListParagraph"/>
+        <w:numPr>
+          <w:ilvl w:val="0"/>
+          <w:numId w:val="3"/>
+        </w:numPr>
+        <w:jc w:val="both"/>
+        <w:rPr>
+          <w:b w:val="0"/>
+          <w:bCs w:val="0"/>
+          <w:sz w:val="24"/>
+          <w:szCs w:val="24"/>
+        </w:rPr>
+      </w:pPr>
+      <w:r>
+        <w:rPr>
+          <w:b w:val="0"/>
+          <w:bCs w:val="0"/>
+          <w:sz w:val="24"/>
+          <w:szCs w:val="24"/>
         </w:rPr>
         <w:t>Eren Dinkçi                 2</w:t>
       </w:r>
     </w:p>
     <w:p>
       <w:pPr>
-        <w:pStyle w:val="Normal"/>
-        <w:jc w:val="both"/>
-      </w:pPr>
-      <w:r>
-        <w:rPr>
-          <w:b w:val="0"/>
-          <w:bCs w:val="0"/>
-          <w:sz w:val="28"/>
-          <w:szCs w:val="28"/>
+        <w:pStyle w:val="ListParagraph"/>
+        <w:numPr>
+          <w:ilvl w:val="0"/>
+          <w:numId w:val="3"/>
+        </w:numPr>
+        <w:jc w:val="both"/>
+        <w:rPr>
+          <w:b w:val="0"/>
+          <w:bCs w:val="0"/>
+          <w:sz w:val="24"/>
+          <w:szCs w:val="24"/>
+        </w:rPr>
+      </w:pPr>
+      <w:r>
+        <w:rPr>
+          <w:b w:val="0"/>
+          <w:bCs w:val="0"/>
+          <w:sz w:val="24"/>
+          <w:szCs w:val="24"/>
         </w:rPr>
         <w:t>Albert Grønbaek             2</w:t>
       </w:r>
     </w:p>
     <w:p>
       <w:pPr>
-        <w:pStyle w:val="Normal"/>
-        <w:jc w:val="both"/>
-      </w:pPr>
-      <w:r>
-        <w:rPr>
-          <w:b w:val="0"/>
-          <w:bCs w:val="0"/>
-          <w:sz w:val="28"/>
-          <w:szCs w:val="28"/>
+        <w:pStyle w:val="ListParagraph"/>
+        <w:numPr>
+          <w:ilvl w:val="0"/>
+          <w:numId w:val="3"/>
+        </w:numPr>
+        <w:jc w:val="both"/>
+        <w:rPr>
+          <w:b w:val="0"/>
+          <w:bCs w:val="0"/>
+          <w:sz w:val="24"/>
+          <w:szCs w:val="24"/>
+        </w:rPr>
+      </w:pPr>
+      <w:r>
+        <w:rPr>
+          <w:b w:val="0"/>
+          <w:bCs w:val="0"/>
+          <w:sz w:val="24"/>
+          <w:szCs w:val="24"/>
         </w:rPr>
         <w:t>Martin Satriano             2</w:t>
       </w:r>
     </w:p>
     <w:p>
       <w:pPr>
-        <w:pStyle w:val="Normal"/>
-        <w:jc w:val="both"/>
-      </w:pPr>
-      <w:r>
-        <w:rPr>
-          <w:b w:val="0"/>
-          <w:bCs w:val="0"/>
-          <w:sz w:val="28"/>
-          <w:szCs w:val="28"/>
+        <w:pStyle w:val="ListParagraph"/>
+        <w:numPr>
+          <w:ilvl w:val="0"/>
+          <w:numId w:val="3"/>
+        </w:numPr>
+        <w:jc w:val="both"/>
+        <w:rPr>
+          <w:b w:val="0"/>
+          <w:bCs w:val="0"/>
+          <w:sz w:val="24"/>
+          <w:szCs w:val="24"/>
+        </w:rPr>
+      </w:pPr>
+      <w:r>
+        <w:rPr>
+          <w:b w:val="0"/>
+          <w:bCs w:val="0"/>
+          <w:sz w:val="24"/>
+          <w:szCs w:val="24"/>
         </w:rPr>
         <w:t>Mamadou Sarr                2</w:t>
       </w:r>
     </w:p>
     <w:p>
       <w:pPr>
-        <w:pStyle w:val="Normal"/>
-        <w:jc w:val="both"/>
-      </w:pPr>
-      <w:r>
-        <w:rPr>
-          <w:b w:val="0"/>
-          <w:bCs w:val="0"/>
-          <w:sz w:val="28"/>
-          <w:szCs w:val="28"/>
+        <w:pStyle w:val="ListParagraph"/>
+        <w:numPr>
+          <w:ilvl w:val="0"/>
+          <w:numId w:val="3"/>
+        </w:numPr>
+        <w:jc w:val="both"/>
+        <w:rPr>
+          <w:b w:val="0"/>
+          <w:bCs w:val="0"/>
+          <w:sz w:val="24"/>
+          <w:szCs w:val="24"/>
+        </w:rPr>
+      </w:pPr>
+      <w:r>
+        <w:rPr>
+          <w:b w:val="0"/>
+          <w:bCs w:val="0"/>
+          <w:sz w:val="24"/>
+          <w:szCs w:val="24"/>
         </w:rPr>
         <w:t>Marc Guéhi                  2</w:t>
       </w:r>
     </w:p>
     <w:p>
       <w:pPr>
-        <w:pStyle w:val="Normal"/>
-        <w:jc w:val="both"/>
-      </w:pPr>
-      <w:r>
-        <w:rPr>
-          <w:b w:val="0"/>
-          <w:bCs w:val="0"/>
-          <w:sz w:val="28"/>
-          <w:szCs w:val="28"/>
+        <w:pStyle w:val="ListParagraph"/>
+        <w:numPr>
+          <w:ilvl w:val="0"/>
+          <w:numId w:val="3"/>
+        </w:numPr>
+        <w:jc w:val="both"/>
+        <w:rPr>
+          <w:b w:val="0"/>
+          <w:bCs w:val="0"/>
+          <w:sz w:val="24"/>
+          <w:szCs w:val="24"/>
+        </w:rPr>
+      </w:pPr>
+      <w:r>
+        <w:rPr>
+          <w:b w:val="0"/>
+          <w:bCs w:val="0"/>
+          <w:sz w:val="24"/>
+          <w:szCs w:val="24"/>
         </w:rPr>
         <w:t>Fer López                   2</w:t>
       </w:r>
     </w:p>
     <w:p>
       <w:pPr>
-        <w:pStyle w:val="Normal"/>
-        <w:jc w:val="both"/>
-      </w:pPr>
-      <w:r>
-        <w:rPr>
-          <w:b w:val="0"/>
-          <w:bCs w:val="0"/>
-          <w:sz w:val="28"/>
-          <w:szCs w:val="28"/>
+        <w:pStyle w:val="ListParagraph"/>
+        <w:numPr>
+          <w:ilvl w:val="0"/>
+          <w:numId w:val="3"/>
+        </w:numPr>
+        <w:jc w:val="both"/>
+        <w:rPr>
+          <w:b w:val="0"/>
+          <w:bCs w:val="0"/>
+          <w:sz w:val="24"/>
+          <w:szCs w:val="24"/>
+        </w:rPr>
+      </w:pPr>
+      <w:r>
+        <w:rPr>
+          <w:b w:val="0"/>
+          <w:bCs w:val="0"/>
+          <w:sz w:val="24"/>
+          <w:szCs w:val="24"/>
         </w:rPr>
         <w:t>Arnaud Nordin               2</w:t>
       </w:r>
     </w:p>
     <w:p>
       <w:pPr>
-        <w:pStyle w:val="Normal"/>
-        <w:jc w:val="both"/>
-      </w:pPr>
-      <w:r>
-        <w:rPr>
-          <w:b w:val="0"/>
-          <w:bCs w:val="0"/>
-          <w:sz w:val="28"/>
-          <w:szCs w:val="28"/>
+        <w:pStyle w:val="ListParagraph"/>
+        <w:numPr>
+          <w:ilvl w:val="0"/>
+          <w:numId w:val="3"/>
+        </w:numPr>
+        <w:jc w:val="both"/>
+        <w:rPr>
+          <w:b w:val="0"/>
+          <w:bCs w:val="0"/>
+          <w:sz w:val="24"/>
+          <w:szCs w:val="24"/>
+        </w:rPr>
+      </w:pPr>
+      <w:r>
+        <w:rPr>
+          <w:b w:val="0"/>
+          <w:bCs w:val="0"/>
+          <w:sz w:val="24"/>
+          <w:szCs w:val="24"/>
         </w:rPr>
         <w:t>Hans Nicolussi Caviglia     2</w:t>
       </w:r>
     </w:p>
     <w:p>
       <w:pPr>
-        <w:pStyle w:val="Normal"/>
-        <w:jc w:val="both"/>
-      </w:pPr>
-      <w:r>
-        <w:rPr>
-          <w:b w:val="0"/>
-          <w:bCs w:val="0"/>
-          <w:sz w:val="28"/>
-          <w:szCs w:val="28"/>
+        <w:pStyle w:val="ListParagraph"/>
+        <w:numPr>
+          <w:ilvl w:val="0"/>
+          <w:numId w:val="3"/>
+        </w:numPr>
+        <w:jc w:val="both"/>
+        <w:rPr>
+          <w:b w:val="0"/>
+          <w:bCs w:val="0"/>
+          <w:sz w:val="24"/>
+          <w:szCs w:val="24"/>
+        </w:rPr>
+      </w:pPr>
+      <w:r>
+        <w:rPr>
+          <w:b w:val="0"/>
+          <w:bCs w:val="0"/>
+          <w:sz w:val="24"/>
+          <w:szCs w:val="24"/>
         </w:rPr>
         <w:t>Ademola Lookman             2</w:t>
       </w:r>
     </w:p>
     <w:p>
       <w:pPr>
-        <w:pStyle w:val="Normal"/>
-        <w:jc w:val="both"/>
-      </w:pPr>
-      <w:r>
-        <w:rPr>
-          <w:b w:val="0"/>
-          <w:bCs w:val="0"/>
-          <w:sz w:val="28"/>
-          <w:szCs w:val="28"/>
+        <w:pStyle w:val="ListParagraph"/>
+        <w:numPr>
+          <w:ilvl w:val="0"/>
+          <w:numId w:val="3"/>
+        </w:numPr>
+        <w:jc w:val="both"/>
+        <w:rPr>
+          <w:b w:val="0"/>
+          <w:bCs w:val="0"/>
+          <w:sz w:val="24"/>
+          <w:szCs w:val="24"/>
+        </w:rPr>
+      </w:pPr>
+      <w:r>
+        <w:rPr>
+          <w:b w:val="0"/>
+          <w:bCs w:val="0"/>
+          <w:sz w:val="24"/>
+          <w:szCs w:val="24"/>
         </w:rPr>
         <w:t>Evann Guessand              2</w:t>
       </w:r>
     </w:p>
     <w:p>
       <w:pPr>
-        <w:pStyle w:val="Normal"/>
-        <w:jc w:val="both"/>
-      </w:pPr>
-      <w:r>
-        <w:rPr>
-          <w:b w:val="0"/>
-          <w:bCs w:val="0"/>
-          <w:sz w:val="28"/>
-          <w:szCs w:val="28"/>
+        <w:pStyle w:val="ListParagraph"/>
+        <w:numPr>
+          <w:ilvl w:val="0"/>
+          <w:numId w:val="3"/>
+        </w:numPr>
+        <w:jc w:val="both"/>
+        <w:rPr>
+          <w:b w:val="0"/>
+          <w:bCs w:val="0"/>
+          <w:sz w:val="24"/>
+          <w:szCs w:val="24"/>
+        </w:rPr>
+      </w:pPr>
+      <w:r>
+        <w:rPr>
+          <w:b w:val="0"/>
+          <w:bCs w:val="0"/>
+          <w:sz w:val="24"/>
+          <w:szCs w:val="24"/>
         </w:rPr>
         <w:t>Idrissa Guèye               2</w:t>
       </w:r>
     </w:p>
     <w:p>
       <w:pPr>
-        <w:pStyle w:val="Normal"/>
-        <w:jc w:val="both"/>
-      </w:pPr>
-      <w:r>
-        <w:rPr>
-          <w:b w:val="0"/>
-          <w:bCs w:val="0"/>
-          <w:sz w:val="28"/>
-          <w:szCs w:val="28"/>
+        <w:pStyle w:val="ListParagraph"/>
+        <w:numPr>
+          <w:ilvl w:val="0"/>
+          <w:numId w:val="3"/>
+        </w:numPr>
+        <w:jc w:val="both"/>
+        <w:rPr>
+          <w:b w:val="0"/>
+          <w:bCs w:val="0"/>
+          <w:sz w:val="24"/>
+          <w:szCs w:val="24"/>
+        </w:rPr>
+      </w:pPr>
+      <w:r>
+        <w:rPr>
+          <w:b w:val="0"/>
+          <w:bCs w:val="0"/>
+          <w:sz w:val="24"/>
+          <w:szCs w:val="24"/>
         </w:rPr>
         <w:t>Álvaro Núñez                2</w:t>
       </w:r>
     </w:p>
     <w:p>
       <w:pPr>
-        <w:pStyle w:val="Normal"/>
-        <w:jc w:val="both"/>
-      </w:pPr>
-      <w:r>
-        <w:rPr>
-          <w:b w:val="0"/>
-          <w:bCs w:val="0"/>
-          <w:sz w:val="28"/>
-          <w:szCs w:val="28"/>
+        <w:pStyle w:val="ListParagraph"/>
+        <w:numPr>
+          <w:ilvl w:val="0"/>
+          <w:numId w:val="3"/>
+        </w:numPr>
+        <w:jc w:val="both"/>
+        <w:rPr>
+          <w:b w:val="0"/>
+          <w:bCs w:val="0"/>
+          <w:sz w:val="24"/>
+          <w:szCs w:val="24"/>
+        </w:rPr>
+      </w:pPr>
+      <w:r>
+        <w:rPr>
+          <w:b w:val="0"/>
+          <w:bCs w:val="0"/>
+          <w:sz w:val="24"/>
+          <w:szCs w:val="24"/>
         </w:rPr>
         <w:t>Unai Núñez                  2</w:t>
       </w:r>
     </w:p>
     <w:p>
       <w:pPr>
-        <w:pStyle w:val="Normal"/>
-        <w:jc w:val="both"/>
-      </w:pPr>
-      <w:r>
-        <w:rPr>
-          <w:b w:val="0"/>
-          <w:bCs w:val="0"/>
-          <w:sz w:val="28"/>
-          <w:szCs w:val="28"/>
+        <w:pStyle w:val="ListParagraph"/>
+        <w:numPr>
+          <w:ilvl w:val="0"/>
+          <w:numId w:val="3"/>
+        </w:numPr>
+        <w:jc w:val="both"/>
+        <w:rPr>
+          <w:b w:val="0"/>
+          <w:bCs w:val="0"/>
+          <w:sz w:val="24"/>
+          <w:szCs w:val="24"/>
+        </w:rPr>
+      </w:pPr>
+      <w:r>
+        <w:rPr>
+          <w:b w:val="0"/>
+          <w:bCs w:val="0"/>
+          <w:sz w:val="24"/>
+          <w:szCs w:val="24"/>
         </w:rPr>
         <w:t>Ethan Nwaneri               2</w:t>
       </w:r>
     </w:p>
     <w:p>
       <w:pPr>
-        <w:pStyle w:val="Normal"/>
-        <w:jc w:val="both"/>
-      </w:pPr>
-      <w:r>
-        <w:rPr>
-          <w:b w:val="0"/>
-          <w:bCs w:val="0"/>
-          <w:sz w:val="28"/>
-          <w:szCs w:val="28"/>
+        <w:pStyle w:val="ListParagraph"/>
+        <w:numPr>
+          <w:ilvl w:val="0"/>
+          <w:numId w:val="3"/>
+        </w:numPr>
+        <w:jc w:val="both"/>
+        <w:rPr>
+          <w:b w:val="0"/>
+          <w:bCs w:val="0"/>
+          <w:sz w:val="24"/>
+          <w:szCs w:val="24"/>
+        </w:rPr>
+      </w:pPr>
+      <w:r>
+        <w:rPr>
+          <w:b w:val="0"/>
+          <w:bCs w:val="0"/>
+          <w:sz w:val="24"/>
+          <w:szCs w:val="24"/>
         </w:rPr>
         <w:t>M'Bala Nzola                2</w:t>
       </w:r>
     </w:p>
     <w:p>
       <w:pPr>
-        <w:pStyle w:val="Normal"/>
-        <w:jc w:val="both"/>
-      </w:pPr>
-      <w:r>
-        <w:rPr>
-          <w:b w:val="0"/>
-          <w:bCs w:val="0"/>
-          <w:sz w:val="28"/>
-          <w:szCs w:val="28"/>
+        <w:pStyle w:val="ListParagraph"/>
+        <w:numPr>
+          <w:ilvl w:val="0"/>
+          <w:numId w:val="3"/>
+        </w:numPr>
+        <w:jc w:val="both"/>
+        <w:rPr>
+          <w:b w:val="0"/>
+          <w:bCs w:val="0"/>
+          <w:sz w:val="24"/>
+          <w:szCs w:val="24"/>
+        </w:rPr>
+      </w:pPr>
+      <w:r>
+        <w:rPr>
+          <w:b w:val="0"/>
+          <w:bCs w:val="0"/>
+          <w:sz w:val="24"/>
+          <w:szCs w:val="24"/>
         </w:rPr>
         <w:t>Robinio Vaz                 2</w:t>
       </w:r>
     </w:p>
     <w:p>
       <w:pPr>
-        <w:pStyle w:val="Normal"/>
-        <w:jc w:val="both"/>
-      </w:pPr>
-      <w:r>
-        <w:rPr>
-          <w:b w:val="0"/>
-          <w:bCs w:val="0"/>
-          <w:sz w:val="28"/>
-          <w:szCs w:val="28"/>
+        <w:pStyle w:val="ListParagraph"/>
+        <w:numPr>
+          <w:ilvl w:val="0"/>
+          <w:numId w:val="3"/>
+        </w:numPr>
+        <w:jc w:val="both"/>
+        <w:rPr>
+          <w:b w:val="0"/>
+          <w:bCs w:val="0"/>
+          <w:sz w:val="24"/>
+          <w:szCs w:val="24"/>
+        </w:rPr>
+      </w:pPr>
+      <w:r>
+        <w:rPr>
+          <w:b w:val="0"/>
+          <w:bCs w:val="0"/>
+          <w:sz w:val="24"/>
+          <w:szCs w:val="24"/>
         </w:rPr>
         <w:t>Matt O'Riley                2</w:t>
       </w:r>
     </w:p>
     <w:p>
       <w:pPr>
-        <w:pStyle w:val="Normal"/>
-        <w:jc w:val="both"/>
-      </w:pPr>
-      <w:r>
-        <w:rPr>
-          <w:b w:val="0"/>
-          <w:bCs w:val="0"/>
-          <w:sz w:val="28"/>
-          <w:szCs w:val="28"/>
+        <w:pStyle w:val="ListParagraph"/>
+        <w:numPr>
+          <w:ilvl w:val="0"/>
+          <w:numId w:val="3"/>
+        </w:numPr>
+        <w:jc w:val="both"/>
+        <w:rPr>
+          <w:b w:val="0"/>
+          <w:bCs w:val="0"/>
+          <w:sz w:val="24"/>
+          <w:szCs w:val="24"/>
+        </w:rPr>
+      </w:pPr>
+      <w:r>
+        <w:rPr>
+          <w:b w:val="0"/>
+          <w:bCs w:val="0"/>
+          <w:sz w:val="24"/>
+          <w:szCs w:val="24"/>
         </w:rPr>
         <w:t>Sheraldo Becker             2</w:t>
       </w:r>
     </w:p>
     <w:p>
       <w:pPr>
-        <w:pStyle w:val="Normal"/>
-        <w:jc w:val="both"/>
-      </w:pPr>
-      <w:r>
-        <w:rPr>
-          <w:b w:val="0"/>
-          <w:bCs w:val="0"/>
-          <w:sz w:val="28"/>
-          <w:szCs w:val="28"/>
+        <w:pStyle w:val="ListParagraph"/>
+        <w:numPr>
+          <w:ilvl w:val="0"/>
+          <w:numId w:val="3"/>
+        </w:numPr>
+        <w:jc w:val="both"/>
+        <w:rPr>
+          <w:b w:val="0"/>
+          <w:bCs w:val="0"/>
+          <w:sz w:val="24"/>
+          <w:szCs w:val="24"/>
+        </w:rPr>
+      </w:pPr>
+      <w:r>
+        <w:rPr>
+          <w:b w:val="0"/>
+          <w:bCs w:val="0"/>
+          <w:sz w:val="24"/>
+          <w:szCs w:val="24"/>
         </w:rPr>
         <w:t>Matías Vecino               2</w:t>
       </w:r>
     </w:p>
     <w:p>
       <w:pPr>
-        <w:pStyle w:val="Normal"/>
-        <w:jc w:val="both"/>
-      </w:pPr>
-      <w:r>
-        <w:rPr>
-          <w:b w:val="0"/>
-          <w:bCs w:val="0"/>
-          <w:sz w:val="28"/>
-          <w:szCs w:val="28"/>
+        <w:pStyle w:val="ListParagraph"/>
+        <w:numPr>
+          <w:ilvl w:val="0"/>
+          <w:numId w:val="3"/>
+        </w:numPr>
+        <w:jc w:val="both"/>
+        <w:rPr>
+          <w:b w:val="0"/>
+          <w:bCs w:val="0"/>
+          <w:sz w:val="24"/>
+          <w:szCs w:val="24"/>
+        </w:rPr>
+      </w:pPr>
+      <w:r>
+        <w:rPr>
+          <w:b w:val="0"/>
+          <w:bCs w:val="0"/>
+          <w:sz w:val="24"/>
+          <w:szCs w:val="24"/>
         </w:rPr>
         <w:t>David López                 2</w:t>
       </w:r>
@@ -642,13 +1116,19 @@
       <w:pPr>
         <w:pStyle w:val="Normal"/>
         <w:jc w:val="both"/>
-      </w:pPr>
-      <w:r>
-        <w:rPr>
-          <w:b w:val="0"/>
-          <w:bCs w:val="0"/>
-          <w:sz w:val="28"/>
-          <w:szCs w:val="28"/>
+        <w:rPr>
+          <w:b w:val="0"/>
+          <w:bCs w:val="0"/>
+          <w:sz w:val="24"/>
+          <w:szCs w:val="24"/>
+        </w:rPr>
+      </w:pPr>
+      <w:r>
+        <w:rPr>
+          <w:b w:val="0"/>
+          <w:bCs w:val="0"/>
+          <w:sz w:val="24"/>
+          <w:szCs w:val="24"/>
         </w:rPr>
         <w:t xml:space="preserve"> </w:t>
       </w:r>
@@ -660,16 +1140,16 @@
         <w:rPr>
           <w:b w:val="0"/>
           <w:bCs w:val="0"/>
-          <w:sz w:val="28"/>
-          <w:szCs w:val="28"/>
-        </w:rPr>
-      </w:pPr>
-      <w:r>
-        <w:rPr>
-          <w:b w:val="0"/>
-          <w:bCs w:val="0"/>
-          <w:sz w:val="28"/>
-          <w:szCs w:val="28"/>
+          <w:sz w:val="24"/>
+          <w:szCs w:val="24"/>
+        </w:rPr>
+      </w:pPr>
+      <w:r>
+        <w:rPr>
+          <w:b w:val="0"/>
+          <w:bCs w:val="0"/>
+          <w:sz w:val="24"/>
+          <w:szCs w:val="24"/>
         </w:rPr>
         <w:t xml:space="preserve">Durante a análise exploratória identificou-se que a coluna </w:t>
       </w:r>
@@ -677,8 +1157,8 @@
         <w:rPr>
           <w:b w:val="0"/>
           <w:bCs w:val="0"/>
-          <w:sz w:val="28"/>
-          <w:szCs w:val="28"/>
+          <w:sz w:val="24"/>
+          <w:szCs w:val="24"/>
         </w:rPr>
         <w:t>Rk</w:t>
       </w:r>
@@ -686,8 +1166,8 @@
         <w:rPr>
           <w:b w:val="0"/>
           <w:bCs w:val="0"/>
-          <w:sz w:val="28"/>
-          <w:szCs w:val="28"/>
+          <w:sz w:val="24"/>
+          <w:szCs w:val="24"/>
         </w:rPr>
         <w:t xml:space="preserve"> não representa um identificador único de jogador, apresentando múltiplas ocorrências para atletas distintos. Também foram observadas duplicações parciais de registros, exigindo tratamento antes da integração das fontes. Ou seja, </w:t>
       </w:r>
@@ -695,8 +1175,8 @@
         <w:rPr>
           <w:b w:val="0"/>
           <w:bCs w:val="0"/>
-          <w:sz w:val="28"/>
-          <w:szCs w:val="28"/>
+          <w:sz w:val="24"/>
+          <w:szCs w:val="24"/>
         </w:rPr>
         <w:t>não tínhamos nenhum tipo de identificador único.</w:t>
       </w:r>
@@ -708,19 +1188,23 @@
         <w:rPr>
           <w:b w:val="0"/>
           <w:bCs w:val="0"/>
-          <w:sz w:val="28"/>
-          <w:szCs w:val="28"/>
-        </w:rPr>
-      </w:pPr>
-    </w:p>
-    <w:p>
-      <w:pPr>
-        <w:pStyle w:val="Normal"/>
-        <w:jc w:val="both"/>
+          <w:sz w:val="24"/>
+          <w:szCs w:val="24"/>
+        </w:rPr>
+      </w:pPr>
+    </w:p>
+    <w:p>
+      <w:pPr>
+        <w:pStyle w:val="Normal"/>
+        <w:jc w:val="both"/>
+        <w:rPr>
+          <w:sz w:val="24"/>
+          <w:szCs w:val="24"/>
+        </w:rPr>
       </w:pPr>
       <w:r>
         <w:drawing>
-          <wp:inline wp14:editId="70D1C1CB" wp14:anchorId="5BF94FEA">
+          <wp:inline wp14:editId="00E2030C" wp14:anchorId="5BF94FEA">
             <wp:extent cx="2762636" cy="1914792"/>
             <wp:effectExtent l="0" t="0" r="0" b="0"/>
             <wp:docPr id="264765289" name="drawing"/>
@@ -766,14 +1250,16 @@
       <w:pPr>
         <w:pStyle w:val="Normal"/>
         <w:jc w:val="both"/>
-      </w:pPr>
-    </w:p>
-    <w:p>
-      <w:pPr>
-        <w:pStyle w:val="Normal"/>
-        <w:jc w:val="both"/>
-      </w:pPr>
-      <w:r>
+        <w:rPr>
+          <w:sz w:val="24"/>
+          <w:szCs w:val="24"/>
+        </w:rPr>
+      </w:pPr>
+    </w:p>
+    <w:p>
+      <w:pPr>
+        <w:pStyle w:val="Normal"/>
+        <w:jc w:val="both"/>
         <w:rPr>
           <w:rFonts w:ascii="Aptos" w:hAnsi="Aptos" w:eastAsia="Aptos" w:cs="Aptos"/>
           <w:noProof w:val="0"/>
@@ -781,13 +1267,8 @@
           <w:szCs w:val="24"/>
           <w:lang w:val="pt-BR"/>
         </w:rPr>
-        <w:t>Durante a inspeção dos dados foram identificados quatro jogadores com oito registros duplicados cada, totalizando 32 linhas inconsistentes. A análise mostrou que as duplicações resultavam de combinações conflitantes de estatísticas ofensivas e defensivas para o mesmo atleta. Como esses casos representavam apenas 0,13% da base, optou-se por manter apenas um registro por combinação (jogador, ano de nascimento e clube), removendo as duplicidades antes das etapas de integração e modelagem.</w:t>
-      </w:r>
-    </w:p>
-    <w:p>
-      <w:pPr>
-        <w:pStyle w:val="Normal"/>
-        <w:jc w:val="both"/>
+      </w:pPr>
+      <w:r>
         <w:rPr>
           <w:rFonts w:ascii="Aptos" w:hAnsi="Aptos" w:eastAsia="Aptos" w:cs="Aptos"/>
           <w:noProof w:val="0"/>
@@ -795,16 +1276,34 @@
           <w:szCs w:val="24"/>
           <w:lang w:val="pt-BR"/>
         </w:rPr>
-      </w:pPr>
-    </w:p>
-    <w:p>
-      <w:pPr>
-        <w:pStyle w:val="Normal"/>
-        <w:jc w:val="both"/>
+        <w:t>Durante a inspeção dos dados foram identificados quatro jogadores com oito registros duplicados cada, totalizando 32 linhas inconsistentes. A análise mostrou que as duplicações resultavam de combinações conflitantes de estatísticas ofensivas e defensivas para o mesmo atleta. Como esses casos representavam apenas 0,13% da base, optou-se por manter apenas um registro por combinação (jogador, ano de nascimento e clube), removendo as duplicidades antes das etapas de integração e modelagem.</w:t>
+      </w:r>
+    </w:p>
+    <w:p>
+      <w:pPr>
+        <w:pStyle w:val="Normal"/>
+        <w:jc w:val="both"/>
+        <w:rPr>
+          <w:rFonts w:ascii="Aptos" w:hAnsi="Aptos" w:eastAsia="Aptos" w:cs="Aptos"/>
+          <w:noProof w:val="0"/>
+          <w:sz w:val="24"/>
+          <w:szCs w:val="24"/>
+          <w:lang w:val="pt-BR"/>
+        </w:rPr>
+      </w:pPr>
+    </w:p>
+    <w:p>
+      <w:pPr>
+        <w:pStyle w:val="Normal"/>
+        <w:jc w:val="both"/>
+        <w:rPr>
+          <w:sz w:val="24"/>
+          <w:szCs w:val="24"/>
+        </w:rPr>
       </w:pPr>
       <w:r>
         <w:drawing>
-          <wp:inline wp14:editId="3BD27631" wp14:anchorId="4826A21F">
+          <wp:inline wp14:editId="6696D23F" wp14:anchorId="4826A21F">
             <wp:extent cx="3991532" cy="3943900"/>
             <wp:effectExtent l="0" t="0" r="0" b="0"/>
             <wp:docPr id="1004578629" name="drawing"/>
@@ -850,10 +1349,14 @@
       <w:pPr>
         <w:pStyle w:val="Normal"/>
         <w:jc w:val="both"/>
+        <w:rPr>
+          <w:sz w:val="24"/>
+          <w:szCs w:val="24"/>
+        </w:rPr>
       </w:pPr>
       <w:r>
         <w:drawing>
-          <wp:inline wp14:editId="57FC43FB" wp14:anchorId="76E9824A">
+          <wp:inline wp14:editId="78A5D6B5" wp14:anchorId="76E9824A">
             <wp:extent cx="4258269" cy="1952898"/>
             <wp:effectExtent l="0" t="0" r="0" b="0"/>
             <wp:docPr id="885699406" name="drawing"/>
@@ -899,114 +1402,896 @@
       <w:pPr>
         <w:pStyle w:val="Normal"/>
         <w:jc w:val="both"/>
-      </w:pPr>
-    </w:p>
-    <w:p>
-      <w:pPr>
-        <w:pStyle w:val="Normal"/>
+        <w:rPr>
+          <w:sz w:val="24"/>
+          <w:szCs w:val="24"/>
+        </w:rPr>
+      </w:pPr>
+    </w:p>
+    <w:p>
+      <w:pPr>
+        <w:pStyle w:val="Normal"/>
+        <w:jc w:val="both"/>
+        <w:rPr>
+          <w:sz w:val="24"/>
+          <w:szCs w:val="24"/>
+        </w:rPr>
+      </w:pPr>
+      <w:r>
+        <w:rPr>
+          <w:sz w:val="24"/>
+          <w:szCs w:val="24"/>
+        </w:rPr>
+        <w:t xml:space="preserve">Encontramos no caminho 3 registros que tinham Nation = </w:t>
+      </w:r>
+      <w:r>
+        <w:rPr>
+          <w:sz w:val="24"/>
+          <w:szCs w:val="24"/>
+        </w:rPr>
+        <w:t>Na</w:t>
+      </w:r>
+      <w:r>
+        <w:rPr>
+          <w:sz w:val="24"/>
+          <w:szCs w:val="24"/>
+        </w:rPr>
+        <w:t>N</w:t>
+      </w:r>
+      <w:r>
+        <w:rPr>
+          <w:sz w:val="24"/>
+          <w:szCs w:val="24"/>
+        </w:rPr>
+        <w:t>, 2 deles sem</w:t>
+      </w:r>
+      <w:r>
+        <w:rPr>
+          <w:sz w:val="24"/>
+          <w:szCs w:val="24"/>
+        </w:rPr>
+        <w:t xml:space="preserve"> valor nos campos</w:t>
+      </w:r>
+      <w:r>
+        <w:rPr>
+          <w:sz w:val="24"/>
+          <w:szCs w:val="24"/>
+        </w:rPr>
+        <w:t xml:space="preserve"> </w:t>
+      </w:r>
+      <w:r>
+        <w:rPr>
+          <w:sz w:val="24"/>
+          <w:szCs w:val="24"/>
+        </w:rPr>
+        <w:t>“</w:t>
+      </w:r>
+      <w:r>
+        <w:rPr>
+          <w:sz w:val="24"/>
+          <w:szCs w:val="24"/>
+        </w:rPr>
+        <w:t>Age</w:t>
+      </w:r>
+      <w:r>
+        <w:rPr>
+          <w:sz w:val="24"/>
+          <w:szCs w:val="24"/>
+        </w:rPr>
+        <w:t>”</w:t>
+      </w:r>
+      <w:r>
+        <w:rPr>
+          <w:sz w:val="24"/>
+          <w:szCs w:val="24"/>
+        </w:rPr>
+        <w:t xml:space="preserve"> </w:t>
+      </w:r>
+      <w:r>
+        <w:rPr>
+          <w:sz w:val="24"/>
+          <w:szCs w:val="24"/>
+        </w:rPr>
+        <w:t>e</w:t>
+      </w:r>
+      <w:r>
+        <w:rPr>
+          <w:sz w:val="24"/>
+          <w:szCs w:val="24"/>
+        </w:rPr>
+        <w:t xml:space="preserve"> </w:t>
+      </w:r>
+      <w:r>
+        <w:rPr>
+          <w:sz w:val="24"/>
+          <w:szCs w:val="24"/>
+        </w:rPr>
+        <w:t>“</w:t>
+      </w:r>
+      <w:r>
+        <w:rPr>
+          <w:sz w:val="24"/>
+          <w:szCs w:val="24"/>
+        </w:rPr>
+        <w:t>Born</w:t>
+      </w:r>
+      <w:r>
+        <w:rPr>
+          <w:sz w:val="24"/>
+          <w:szCs w:val="24"/>
+        </w:rPr>
+        <w:t>”</w:t>
+      </w:r>
+      <w:r>
+        <w:rPr>
+          <w:sz w:val="24"/>
+          <w:szCs w:val="24"/>
+        </w:rPr>
+        <w:t xml:space="preserve">. Optamos por manter como </w:t>
+      </w:r>
+      <w:r>
+        <w:rPr>
+          <w:sz w:val="24"/>
+          <w:szCs w:val="24"/>
+        </w:rPr>
+        <w:t>NaN</w:t>
+      </w:r>
+      <w:r>
+        <w:rPr>
+          <w:sz w:val="24"/>
+          <w:szCs w:val="24"/>
+        </w:rPr>
+        <w:t>, pois não é um dado decisivo.</w:t>
+      </w:r>
+    </w:p>
+    <w:p>
+      <w:pPr>
+        <w:pStyle w:val="Normal"/>
+        <w:jc w:val="both"/>
+        <w:rPr>
+          <w:sz w:val="24"/>
+          <w:szCs w:val="24"/>
+        </w:rPr>
+      </w:pPr>
+      <w:r>
+        <w:rPr>
+          <w:sz w:val="24"/>
+          <w:szCs w:val="24"/>
+        </w:rPr>
+        <w:t xml:space="preserve">Após fazer o merge dos dois </w:t>
+      </w:r>
+      <w:r>
+        <w:rPr>
+          <w:sz w:val="24"/>
+          <w:szCs w:val="24"/>
+        </w:rPr>
+        <w:t>datasets</w:t>
+      </w:r>
+      <w:r>
+        <w:rPr>
+          <w:sz w:val="24"/>
+          <w:szCs w:val="24"/>
+        </w:rPr>
+        <w:t>, foi necessário mudar o nome dos campos para que a compreensão fosse mais fácil e para ficar igual à sugestão do professor</w:t>
+      </w:r>
+      <w:r>
+        <w:rPr>
+          <w:sz w:val="24"/>
+          <w:szCs w:val="24"/>
+        </w:rPr>
+        <w:t>. Fizemos uma lista para definir o nome novo para cada campo, além de fazer outra lista para definir quais os campos serão mostrados (pois existiam muito mais do que os neces</w:t>
+      </w:r>
+      <w:r>
+        <w:rPr>
+          <w:sz w:val="24"/>
+          <w:szCs w:val="24"/>
+        </w:rPr>
+        <w:t xml:space="preserve">sários). Como é um trabalho com relativamente poucos campos, não foi tão desafiador, mas certamente se tivessem muitos campos de interesse, essa etapa levaria muito mais tempo </w:t>
+      </w:r>
+      <w:r>
+        <w:rPr>
+          <w:sz w:val="24"/>
+          <w:szCs w:val="24"/>
+        </w:rPr>
+        <w:t>ou teria que ser feita de uma forma diferente da que foi usada nesse trabalho.</w:t>
+      </w:r>
+    </w:p>
+    <w:p>
+      <w:pPr>
+        <w:pStyle w:val="Normal"/>
+        <w:jc w:val="both"/>
+        <w:rPr>
+          <w:rFonts w:ascii="Aptos" w:hAnsi="Aptos" w:eastAsia="Aptos" w:cs="Aptos"/>
+          <w:noProof w:val="0"/>
+          <w:sz w:val="24"/>
+          <w:szCs w:val="24"/>
+          <w:lang w:val="pt-BR"/>
+        </w:rPr>
+      </w:pPr>
+      <w:r>
+        <w:rPr>
+          <w:rFonts w:ascii="Aptos" w:hAnsi="Aptos" w:eastAsia="Aptos" w:cs="Aptos"/>
+          <w:noProof w:val="0"/>
+          <w:sz w:val="24"/>
+          <w:szCs w:val="24"/>
+          <w:lang w:val="pt-BR"/>
+        </w:rPr>
+        <w:t xml:space="preserve">A integração foi realizada por correspondência de nomes normalizados. Alguns atletas possuem nomes idênticos em clubes distintos (ex.: Vitinha), o que pode gerar associações incorretas de valor de mercado. Essas ocorrências foram consideradas limitações da integração por falta de identificadores únicos compartilhados entre as bases. O </w:t>
+      </w:r>
+      <w:r>
+        <w:rPr>
+          <w:rFonts w:ascii="Aptos" w:hAnsi="Aptos" w:eastAsia="Aptos" w:cs="Aptos"/>
+          <w:noProof w:val="0"/>
+          <w:sz w:val="24"/>
+          <w:szCs w:val="24"/>
+          <w:lang w:val="pt-BR"/>
+        </w:rPr>
+        <w:t>dataset</w:t>
+      </w:r>
+      <w:r>
+        <w:rPr>
+          <w:rFonts w:ascii="Aptos" w:hAnsi="Aptos" w:eastAsia="Aptos" w:cs="Aptos"/>
+          <w:noProof w:val="0"/>
+          <w:sz w:val="24"/>
+          <w:szCs w:val="24"/>
+          <w:lang w:val="pt-BR"/>
+        </w:rPr>
+        <w:t xml:space="preserve"> do </w:t>
+      </w:r>
+      <w:r>
+        <w:rPr>
+          <w:rFonts w:ascii="Aptos" w:hAnsi="Aptos" w:eastAsia="Aptos" w:cs="Aptos"/>
+          <w:noProof w:val="0"/>
+          <w:sz w:val="24"/>
+          <w:szCs w:val="24"/>
+          <w:lang w:val="pt-BR"/>
+        </w:rPr>
+        <w:t>transfermarkt</w:t>
+      </w:r>
+      <w:r>
+        <w:rPr>
+          <w:rFonts w:ascii="Aptos" w:hAnsi="Aptos" w:eastAsia="Aptos" w:cs="Aptos"/>
+          <w:noProof w:val="0"/>
+          <w:sz w:val="24"/>
+          <w:szCs w:val="24"/>
+          <w:lang w:val="pt-BR"/>
+        </w:rPr>
+        <w:t xml:space="preserve"> possui apenas nome e valor, para ser possível diferenciar, seriam necessários mais dados.</w:t>
+      </w:r>
+    </w:p>
+    <w:p>
+      <w:pPr>
+        <w:pStyle w:val="Normal"/>
+        <w:jc w:val="both"/>
+        <w:rPr>
+          <w:sz w:val="24"/>
+          <w:szCs w:val="24"/>
+        </w:rPr>
+      </w:pPr>
+      <w:r>
+        <w:rPr>
+          <w:sz w:val="24"/>
+          <w:szCs w:val="24"/>
+        </w:rPr>
+        <w:t xml:space="preserve"> </w:t>
+      </w:r>
+      <w:r>
+        <w:drawing>
+          <wp:inline wp14:editId="50B9820E" wp14:anchorId="7C737458">
+            <wp:extent cx="3334215" cy="809738"/>
+            <wp:effectExtent l="0" t="0" r="0" b="0"/>
+            <wp:docPr id="788250203" name="drawing"/>
+            <wp:cNvGraphicFramePr>
+              <a:graphicFrameLocks noChangeAspect="1"/>
+            </wp:cNvGraphicFramePr>
+            <a:graphic>
+              <a:graphicData xmlns:a="http://schemas.openxmlformats.org/drawingml/2006/main" uri="http://schemas.openxmlformats.org/drawingml/2006/picture">
+                <pic:pic xmlns:pic="http://schemas.openxmlformats.org/drawingml/2006/picture">
+                  <pic:nvPicPr>
+                    <pic:cNvPr id="788250203" name="Picture 788250203"/>
+                    <pic:cNvPicPr/>
+                  </pic:nvPicPr>
+                  <pic:blipFill>
+                    <a:blip xmlns:r="http://schemas.openxmlformats.org/officeDocument/2006/relationships" r:embed="rId1814214343">
+                      <a:extLst>
+                        <a:ext uri="{28A0092B-C50C-407E-A947-70E740481C1C}">
+                          <a14:useLocalDpi xmlns:a14="http://schemas.microsoft.com/office/drawing/2010/main"/>
+                        </a:ext>
+                      </a:extLst>
+                    </a:blip>
+                    <a:stretch>
+                      <a:fillRect/>
+                    </a:stretch>
+                  </pic:blipFill>
+                  <pic:spPr>
+                    <a:xfrm>
+                      <a:off x="0" y="0"/>
+                      <a:ext cx="3334215" cy="809738"/>
+                    </a:xfrm>
+                    <a:prstGeom prst="rect">
+                      <a:avLst/>
+                    </a:prstGeom>
+                  </pic:spPr>
+                </pic:pic>
+              </a:graphicData>
+            </a:graphic>
+          </wp:inline>
+        </w:drawing>
+      </w:r>
+    </w:p>
+    <w:p>
+      <w:pPr>
+        <w:pStyle w:val="Normal"/>
+        <w:jc w:val="both"/>
+        <w:rPr>
+          <w:sz w:val="24"/>
+          <w:szCs w:val="24"/>
+        </w:rPr>
+      </w:pPr>
+    </w:p>
+    <w:p>
+      <w:pPr>
+        <w:pStyle w:val="Normal"/>
+        <w:jc w:val="both"/>
+        <w:rPr>
+          <w:sz w:val="24"/>
+          <w:szCs w:val="24"/>
+        </w:rPr>
+      </w:pPr>
+      <w:r>
+        <w:rPr>
+          <w:sz w:val="24"/>
+          <w:szCs w:val="24"/>
+        </w:rPr>
+        <w:t>Jogadores obtidos por fonte:</w:t>
+      </w:r>
+    </w:p>
+    <w:p>
+      <w:pPr>
+        <w:pStyle w:val="ListParagraph"/>
+        <w:numPr>
+          <w:ilvl w:val="0"/>
+          <w:numId w:val="1"/>
+        </w:numPr>
+        <w:jc w:val="both"/>
+        <w:rPr>
+          <w:sz w:val="24"/>
+          <w:szCs w:val="24"/>
+        </w:rPr>
+      </w:pPr>
+      <w:r>
+        <w:rPr>
+          <w:sz w:val="24"/>
+          <w:szCs w:val="24"/>
+        </w:rPr>
+        <w:t>Transfermarkt</w:t>
+      </w:r>
+      <w:r>
+        <w:rPr>
+          <w:sz w:val="24"/>
+          <w:szCs w:val="24"/>
+        </w:rPr>
+        <w:t>: 200</w:t>
+      </w:r>
+    </w:p>
+    <w:p>
+      <w:pPr>
+        <w:pStyle w:val="ListParagraph"/>
+        <w:numPr>
+          <w:ilvl w:val="0"/>
+          <w:numId w:val="1"/>
+        </w:numPr>
+        <w:jc w:val="both"/>
+        <w:rPr>
+          <w:sz w:val="24"/>
+          <w:szCs w:val="24"/>
+        </w:rPr>
+      </w:pPr>
+      <w:r>
+        <w:rPr>
+          <w:sz w:val="24"/>
+          <w:szCs w:val="24"/>
+        </w:rPr>
+        <w:t>Fbref</w:t>
+      </w:r>
+      <w:r>
+        <w:rPr>
+          <w:sz w:val="24"/>
+          <w:szCs w:val="24"/>
+        </w:rPr>
+        <w:t>: 2953</w:t>
+      </w:r>
+    </w:p>
+    <w:p>
+      <w:pPr>
+        <w:pStyle w:val="Normal"/>
+        <w:ind w:left="0"/>
+        <w:jc w:val="both"/>
+        <w:rPr>
+          <w:sz w:val="24"/>
+          <w:szCs w:val="24"/>
+        </w:rPr>
+      </w:pPr>
+      <w:r>
+        <w:rPr>
+          <w:sz w:val="24"/>
+          <w:szCs w:val="24"/>
+        </w:rPr>
+        <w:t xml:space="preserve">Jogadores no </w:t>
+      </w:r>
+      <w:r>
+        <w:rPr>
+          <w:sz w:val="24"/>
+          <w:szCs w:val="24"/>
+        </w:rPr>
+        <w:t>dataset</w:t>
+      </w:r>
+      <w:r>
+        <w:rPr>
+          <w:sz w:val="24"/>
+          <w:szCs w:val="24"/>
+        </w:rPr>
+        <w:t xml:space="preserve"> final:</w:t>
+      </w:r>
+    </w:p>
+    <w:p>
+      <w:pPr>
+        <w:pStyle w:val="ListParagraph"/>
+        <w:numPr>
+          <w:ilvl w:val="0"/>
+          <w:numId w:val="2"/>
+        </w:numPr>
+        <w:jc w:val="both"/>
+        <w:rPr>
+          <w:sz w:val="24"/>
+          <w:szCs w:val="24"/>
+        </w:rPr>
+      </w:pPr>
+      <w:r>
+        <w:rPr>
+          <w:sz w:val="24"/>
+          <w:szCs w:val="24"/>
+        </w:rPr>
+        <w:t>Com valor de mercado: 196</w:t>
+      </w:r>
+    </w:p>
+    <w:p>
+      <w:pPr>
+        <w:pStyle w:val="ListParagraph"/>
+        <w:numPr>
+          <w:ilvl w:val="0"/>
+          <w:numId w:val="2"/>
+        </w:numPr>
+        <w:jc w:val="both"/>
+        <w:rPr>
+          <w:sz w:val="24"/>
+          <w:szCs w:val="24"/>
+        </w:rPr>
+      </w:pPr>
+      <w:r>
+        <w:rPr>
+          <w:sz w:val="24"/>
+          <w:szCs w:val="24"/>
+        </w:rPr>
+        <w:t>Sem valor de mercado: 2729</w:t>
+      </w:r>
+    </w:p>
+    <w:p>
+      <w:pPr>
+        <w:pStyle w:val="Normal"/>
+        <w:ind w:left="0"/>
+        <w:jc w:val="both"/>
+        <w:rPr>
+          <w:sz w:val="28"/>
+          <w:szCs w:val="28"/>
+        </w:rPr>
+      </w:pPr>
+    </w:p>
+    <w:p>
+      <w:pPr>
+        <w:pStyle w:val="Normal"/>
+        <w:ind w:left="0"/>
+        <w:jc w:val="both"/>
+        <w:rPr>
+          <w:sz w:val="32"/>
+          <w:szCs w:val="32"/>
+        </w:rPr>
+      </w:pPr>
+      <w:r>
+        <w:rPr>
+          <w:sz w:val="28"/>
+          <w:szCs w:val="28"/>
+        </w:rPr>
+        <w:t>Etapa 2 — Pré-processamento e Análise Exploratória</w:t>
+      </w:r>
+    </w:p>
+    <w:p>
+      <w:pPr>
+        <w:pStyle w:val="Normal"/>
+        <w:ind w:left="0"/>
+        <w:jc w:val="both"/>
+        <w:rPr>
+          <w:sz w:val="24"/>
+          <w:szCs w:val="24"/>
+        </w:rPr>
+      </w:pPr>
+      <w:r>
+        <w:rPr>
+          <w:sz w:val="24"/>
+          <w:szCs w:val="24"/>
+        </w:rPr>
+        <w:t xml:space="preserve">Dos itens pedidos para a limpeza, o valor de mercado e valores ausentes posicionais já foram feitos na etapa </w:t>
+      </w:r>
+      <w:r>
+        <w:rPr>
+          <w:sz w:val="24"/>
+          <w:szCs w:val="24"/>
+        </w:rPr>
+        <w:t>1.</w:t>
+      </w:r>
+    </w:p>
+    <w:p>
+      <w:pPr>
+        <w:pStyle w:val="Normal"/>
+        <w:ind w:left="0"/>
+        <w:jc w:val="both"/>
+        <w:rPr>
+          <w:sz w:val="24"/>
+          <w:szCs w:val="24"/>
+        </w:rPr>
+      </w:pPr>
+      <w:r>
+        <w:rPr>
+          <w:sz w:val="24"/>
+          <w:szCs w:val="24"/>
+        </w:rPr>
+        <w:t>Em casos de múltiplas posições, foi adotada a posição mais ofensiva presente no registro. Dessa forma, jogadores classificados como "FW,MF" foram considerados atacantes (FW), enquanto "MF,DF" foram considerados meio-campistas (MF).</w:t>
+      </w:r>
+    </w:p>
+    <w:p>
+      <w:pPr>
+        <w:pStyle w:val="Normal"/>
+        <w:ind w:left="0"/>
+        <w:jc w:val="both"/>
+        <w:rPr>
+          <w:sz w:val="24"/>
+          <w:szCs w:val="24"/>
+        </w:rPr>
+      </w:pPr>
+    </w:p>
+    <w:p>
+      <w:pPr>
+        <w:pStyle w:val="Normal"/>
+        <w:ind w:left="0"/>
+        <w:jc w:val="both"/>
+        <w:rPr>
+          <w:b w:val="1"/>
+          <w:bCs w:val="1"/>
+          <w:sz w:val="24"/>
+          <w:szCs w:val="24"/>
+        </w:rPr>
+      </w:pPr>
+      <w:r>
+        <w:rPr>
+          <w:b w:val="1"/>
+          <w:bCs w:val="1"/>
+          <w:sz w:val="24"/>
+          <w:szCs w:val="24"/>
+        </w:rPr>
+        <w:t>Distribuição do Valor de Mercado:</w:t>
+      </w:r>
+    </w:p>
+    <w:p>
+      <w:pPr>
+        <w:pStyle w:val="Normal"/>
+        <w:ind w:left="0"/>
+        <w:jc w:val="both"/>
+        <w:rPr>
+          <w:sz w:val="28"/>
+          <w:szCs w:val="28"/>
+        </w:rPr>
+      </w:pPr>
+    </w:p>
+    <w:p>
+      <w:pPr>
+        <w:pStyle w:val="Normal"/>
+        <w:ind w:left="0"/>
+        <w:jc w:val="both"/>
+        <w:rPr>
+          <w:sz w:val="28"/>
+          <w:szCs w:val="28"/>
+        </w:rPr>
+      </w:pPr>
+    </w:p>
+    <w:p>
+      <w:pPr>
+        <w:pStyle w:val="Normal"/>
+        <w:ind w:left="0"/>
+        <w:jc w:val="both"/>
+      </w:pPr>
+      <w:r>
+        <w:drawing>
+          <wp:inline wp14:editId="746B91D4" wp14:anchorId="3F26CB17">
+            <wp:extent cx="4187248" cy="2724150"/>
+            <wp:effectExtent l="0" t="0" r="0" b="0"/>
+            <wp:docPr id="644963903" name="drawing"/>
+            <wp:cNvGraphicFramePr>
+              <a:graphicFrameLocks noChangeAspect="1"/>
+            </wp:cNvGraphicFramePr>
+            <a:graphic>
+              <a:graphicData xmlns:a="http://schemas.openxmlformats.org/drawingml/2006/main" uri="http://schemas.openxmlformats.org/drawingml/2006/picture">
+                <pic:pic xmlns:pic="http://schemas.openxmlformats.org/drawingml/2006/picture">
+                  <pic:nvPicPr>
+                    <pic:cNvPr id="644963903" name="Picture 644963903"/>
+                    <pic:cNvPicPr/>
+                  </pic:nvPicPr>
+                  <pic:blipFill>
+                    <a:blip xmlns:r="http://schemas.openxmlformats.org/officeDocument/2006/relationships" r:embed="rId1984591537">
+                      <a:extLst>
+                        <a:ext uri="{28A0092B-C50C-407E-A947-70E740481C1C}">
+                          <a14:useLocalDpi xmlns:a14="http://schemas.microsoft.com/office/drawing/2010/main"/>
+                        </a:ext>
+                      </a:extLst>
+                    </a:blip>
+                    <a:stretch>
+                      <a:fillRect/>
+                    </a:stretch>
+                  </pic:blipFill>
+                  <pic:spPr>
+                    <a:xfrm rot="0">
+                      <a:off x="0" y="0"/>
+                      <a:ext cx="4187248" cy="2724150"/>
+                    </a:xfrm>
+                    <a:prstGeom prst="rect">
+                      <a:avLst/>
+                    </a:prstGeom>
+                  </pic:spPr>
+                </pic:pic>
+              </a:graphicData>
+            </a:graphic>
+          </wp:inline>
+        </w:drawing>
+      </w:r>
+    </w:p>
+    <w:p>
+      <w:pPr>
+        <w:pStyle w:val="Normal"/>
+        <w:ind w:left="0"/>
+        <w:jc w:val="both"/>
+        <w:rPr>
+          <w:b w:val="1"/>
+          <w:bCs w:val="1"/>
+          <w:sz w:val="24"/>
+          <w:szCs w:val="24"/>
+        </w:rPr>
+      </w:pPr>
+      <w:r>
+        <w:rPr>
+          <w:b w:val="1"/>
+          <w:bCs w:val="1"/>
+          <w:sz w:val="24"/>
+          <w:szCs w:val="24"/>
+        </w:rPr>
+        <w:t>Perfil médio por posição:</w:t>
+      </w:r>
+    </w:p>
+    <w:p>
+      <w:pPr>
+        <w:pStyle w:val="Normal"/>
+        <w:ind w:left="0"/>
+        <w:jc w:val="both"/>
+      </w:pPr>
+      <w:r>
+        <w:drawing>
+          <wp:inline wp14:editId="2872725F" wp14:anchorId="243564AC">
+            <wp:extent cx="4200525" cy="2781712"/>
+            <wp:effectExtent l="0" t="0" r="0" b="0"/>
+            <wp:docPr id="2063579875" name="drawing"/>
+            <wp:cNvGraphicFramePr>
+              <a:graphicFrameLocks noChangeAspect="1"/>
+            </wp:cNvGraphicFramePr>
+            <a:graphic>
+              <a:graphicData xmlns:a="http://schemas.openxmlformats.org/drawingml/2006/main" uri="http://schemas.openxmlformats.org/drawingml/2006/picture">
+                <pic:pic xmlns:pic="http://schemas.openxmlformats.org/drawingml/2006/picture">
+                  <pic:nvPicPr>
+                    <pic:cNvPr id="2063579875" name="Picture 2063579875"/>
+                    <pic:cNvPicPr/>
+                  </pic:nvPicPr>
+                  <pic:blipFill>
+                    <a:blip xmlns:r="http://schemas.openxmlformats.org/officeDocument/2006/relationships" r:embed="rId742861420">
+                      <a:extLst>
+                        <a:ext uri="{28A0092B-C50C-407E-A947-70E740481C1C}">
+                          <a14:useLocalDpi xmlns:a14="http://schemas.microsoft.com/office/drawing/2010/main"/>
+                        </a:ext>
+                      </a:extLst>
+                    </a:blip>
+                    <a:stretch>
+                      <a:fillRect/>
+                    </a:stretch>
+                  </pic:blipFill>
+                  <pic:spPr>
+                    <a:xfrm rot="0">
+                      <a:off x="0" y="0"/>
+                      <a:ext cx="4200525" cy="2781712"/>
+                    </a:xfrm>
+                    <a:prstGeom prst="rect">
+                      <a:avLst/>
+                    </a:prstGeom>
+                  </pic:spPr>
+                </pic:pic>
+              </a:graphicData>
+            </a:graphic>
+          </wp:inline>
+        </w:drawing>
+      </w:r>
+    </w:p>
+    <w:p>
+      <w:pPr>
+        <w:pStyle w:val="Normal"/>
+        <w:ind w:left="0"/>
+        <w:jc w:val="both"/>
+      </w:pPr>
+    </w:p>
+    <w:p>
+      <w:pPr>
+        <w:pStyle w:val="Normal"/>
+        <w:ind w:left="0"/>
+        <w:jc w:val="both"/>
+        <w:rPr>
+          <w:b w:val="1"/>
+          <w:bCs w:val="1"/>
+        </w:rPr>
+      </w:pPr>
+      <w:r>
+        <w:rPr>
+          <w:b w:val="1"/>
+          <w:bCs w:val="1"/>
+        </w:rPr>
+        <w:t>Top 10 nacionalidades por valor de mercado médio:</w:t>
+      </w:r>
+    </w:p>
+    <w:p>
+      <w:pPr>
+        <w:pStyle w:val="Normal"/>
+        <w:ind w:left="0"/>
+        <w:jc w:val="both"/>
+      </w:pPr>
+      <w:r>
+        <w:drawing>
+          <wp:inline wp14:editId="5C20AB73" wp14:anchorId="4984C76A">
+            <wp:extent cx="4338441" cy="2981325"/>
+            <wp:effectExtent l="0" t="0" r="0" b="0"/>
+            <wp:docPr id="1398254012" name="drawing"/>
+            <wp:cNvGraphicFramePr>
+              <a:graphicFrameLocks noChangeAspect="1"/>
+            </wp:cNvGraphicFramePr>
+            <a:graphic>
+              <a:graphicData xmlns:a="http://schemas.openxmlformats.org/drawingml/2006/main" uri="http://schemas.openxmlformats.org/drawingml/2006/picture">
+                <pic:pic xmlns:pic="http://schemas.openxmlformats.org/drawingml/2006/picture">
+                  <pic:nvPicPr>
+                    <pic:cNvPr id="1398254012" name="Picture 1398254012"/>
+                    <pic:cNvPicPr/>
+                  </pic:nvPicPr>
+                  <pic:blipFill>
+                    <a:blip xmlns:r="http://schemas.openxmlformats.org/officeDocument/2006/relationships" r:embed="rId2136426417">
+                      <a:extLst>
+                        <a:ext uri="{28A0092B-C50C-407E-A947-70E740481C1C}">
+                          <a14:useLocalDpi xmlns:a14="http://schemas.microsoft.com/office/drawing/2010/main"/>
+                        </a:ext>
+                      </a:extLst>
+                    </a:blip>
+                    <a:stretch>
+                      <a:fillRect/>
+                    </a:stretch>
+                  </pic:blipFill>
+                  <pic:spPr>
+                    <a:xfrm rot="0">
+                      <a:off x="0" y="0"/>
+                      <a:ext cx="4338441" cy="2981325"/>
+                    </a:xfrm>
+                    <a:prstGeom prst="rect">
+                      <a:avLst/>
+                    </a:prstGeom>
+                  </pic:spPr>
+                </pic:pic>
+              </a:graphicData>
+            </a:graphic>
+          </wp:inline>
+        </w:drawing>
+      </w:r>
+    </w:p>
+    <w:p>
+      <w:pPr>
+        <w:pStyle w:val="Normal"/>
+        <w:ind w:left="0"/>
+        <w:jc w:val="both"/>
+        <w:rPr>
+          <w:b w:val="1"/>
+          <w:bCs w:val="1"/>
+        </w:rPr>
+      </w:pPr>
+      <w:r>
+        <w:rPr>
+          <w:b w:val="1"/>
+          <w:bCs w:val="1"/>
+        </w:rPr>
+        <w:t>Relação entre idade e valor de mercado:</w:t>
+      </w:r>
+    </w:p>
+    <w:p>
+      <w:pPr>
+        <w:pStyle w:val="Normal"/>
+        <w:ind w:left="0"/>
+        <w:jc w:val="both"/>
+      </w:pPr>
+      <w:r>
+        <w:drawing>
+          <wp:inline wp14:editId="12BB8CCB" wp14:anchorId="0A5E7B54">
+            <wp:extent cx="4356149" cy="3495675"/>
+            <wp:effectExtent l="0" t="0" r="0" b="0"/>
+            <wp:docPr id="203985609" name="drawing"/>
+            <wp:cNvGraphicFramePr>
+              <a:graphicFrameLocks noChangeAspect="1"/>
+            </wp:cNvGraphicFramePr>
+            <a:graphic>
+              <a:graphicData xmlns:a="http://schemas.openxmlformats.org/drawingml/2006/main" uri="http://schemas.openxmlformats.org/drawingml/2006/picture">
+                <pic:pic xmlns:pic="http://schemas.openxmlformats.org/drawingml/2006/picture">
+                  <pic:nvPicPr>
+                    <pic:cNvPr id="203985609" name="Picture 203985609"/>
+                    <pic:cNvPicPr/>
+                  </pic:nvPicPr>
+                  <pic:blipFill>
+                    <a:blip xmlns:r="http://schemas.openxmlformats.org/officeDocument/2006/relationships" r:embed="rId1780963266">
+                      <a:extLst>
+                        <a:ext uri="{28A0092B-C50C-407E-A947-70E740481C1C}">
+                          <a14:useLocalDpi xmlns:a14="http://schemas.microsoft.com/office/drawing/2010/main"/>
+                        </a:ext>
+                      </a:extLst>
+                    </a:blip>
+                    <a:stretch>
+                      <a:fillRect/>
+                    </a:stretch>
+                  </pic:blipFill>
+                  <pic:spPr>
+                    <a:xfrm rot="0">
+                      <a:off x="0" y="0"/>
+                      <a:ext cx="4356149" cy="3495675"/>
+                    </a:xfrm>
+                    <a:prstGeom prst="rect">
+                      <a:avLst/>
+                    </a:prstGeom>
+                  </pic:spPr>
+                </pic:pic>
+              </a:graphicData>
+            </a:graphic>
+          </wp:inline>
+        </w:drawing>
+      </w:r>
+    </w:p>
+    <w:p>
+      <w:pPr>
+        <w:pStyle w:val="Normal"/>
+        <w:ind w:left="0"/>
+        <w:jc w:val="both"/>
+      </w:pPr>
+    </w:p>
+    <w:p>
+      <w:pPr>
+        <w:pStyle w:val="Normal"/>
+        <w:ind w:left="0"/>
         <w:jc w:val="both"/>
       </w:pPr>
       <w:r>
         <w:rPr/>
-        <w:t xml:space="preserve">Encontramos no caminho 3 registros que tinham Nation = </w:t>
+        <w:t xml:space="preserve">**outro </w:t>
       </w:r>
       <w:r>
         <w:rPr/>
-        <w:t>Na</w:t>
+        <w:t>gráfico</w:t>
       </w:r>
       <w:r>
         <w:rPr/>
-        <w:t>N</w:t>
-      </w:r>
-      <w:r>
-        <w:rPr/>
-        <w:t>, 2 deles sem</w:t>
-      </w:r>
-      <w:r>
-        <w:rPr/>
-        <w:t xml:space="preserve"> valor nos campos</w:t>
-      </w:r>
-      <w:r>
-        <w:rPr/>
-        <w:t xml:space="preserve"> </w:t>
-      </w:r>
-      <w:r>
-        <w:rPr/>
-        <w:t>“</w:t>
-      </w:r>
-      <w:r>
-        <w:rPr/>
-        <w:t>Age</w:t>
-      </w:r>
-      <w:r>
-        <w:rPr/>
-        <w:t>”</w:t>
-      </w:r>
-      <w:r>
-        <w:rPr/>
-        <w:t xml:space="preserve"> </w:t>
-      </w:r>
-      <w:r>
-        <w:rPr/>
-        <w:t>e</w:t>
-      </w:r>
-      <w:r>
-        <w:rPr/>
-        <w:t xml:space="preserve"> </w:t>
-      </w:r>
-      <w:r>
-        <w:rPr/>
-        <w:t>“</w:t>
-      </w:r>
-      <w:r>
-        <w:rPr/>
-        <w:t>Born</w:t>
-      </w:r>
-      <w:r>
-        <w:rPr/>
-        <w:t>”</w:t>
-      </w:r>
-      <w:r>
-        <w:rPr/>
-        <w:t xml:space="preserve">. Optamos por manter como </w:t>
-      </w:r>
-      <w:r>
-        <w:rPr/>
-        <w:t>NaN</w:t>
-      </w:r>
-      <w:r>
-        <w:rPr/>
-        <w:t>, pois não é um dado decisivo.</w:t>
-      </w:r>
-    </w:p>
-    <w:p>
-      <w:pPr>
-        <w:pStyle w:val="Normal"/>
-        <w:jc w:val="both"/>
-      </w:pPr>
-      <w:r>
-        <w:rPr/>
-        <w:t xml:space="preserve">Após fazer o merge dos dois </w:t>
-      </w:r>
-      <w:r>
-        <w:rPr/>
-        <w:t>datasets</w:t>
-      </w:r>
-      <w:r>
-        <w:rPr/>
-        <w:t>, foi necessário mudar o nome dos campos para que a compreensão fosse mais fácil e para ficar igual à sugestão do professor</w:t>
-      </w:r>
-      <w:r>
-        <w:rPr/>
-        <w:t>. Fizemos uma lista para definir o nome novo para cada campo, além de fazer outra lista para definir quais os campos serão mostrados (pois existiam muito mais do que os neces</w:t>
-      </w:r>
-      <w:r>
-        <w:rPr/>
-        <w:t xml:space="preserve">sários). Como é um trabalho com relativamente poucos campos, não foi tão desafiador, mas certamente se tivessem muitos campos de interesse, essa etapa levaria muito mais tempo </w:t>
-      </w:r>
-      <w:r>
-        <w:rPr/>
-        <w:t>ou teria que ser feita de uma forma diferente da que foi usada nesse trabalho.</w:t>
+        <w:t xml:space="preserve"> aqui</w:t>
       </w:r>
     </w:p>
     <w:sectPr>
@@ -1017,6 +2302,356 @@
     </w:sectPr>
   </w:body>
 </w:document>
+</file>
+
+<file path=word/numbering.xml><?xml version="1.0" encoding="utf-8"?>
+<w:numbering xmlns:w="http://schemas.openxmlformats.org/wordprocessingml/2006/main">
+  <w:abstractNum xmlns:w="http://schemas.openxmlformats.org/wordprocessingml/2006/main" w:abstractNumId="3">
+    <w:nsid w:val="634f78ac"/>
+    <w:multiLevelType xmlns:w="http://schemas.openxmlformats.org/wordprocessingml/2006/main" w:val="hybridMultilevel"/>
+    <w:lvl xmlns:w="http://schemas.openxmlformats.org/wordprocessingml/2006/main" w:ilvl="0">
+      <w:start w:val="1"/>
+      <w:numFmt w:val="bullet"/>
+      <w:lvlText w:val=""/>
+      <w:lvlJc w:val="left"/>
+      <w:pPr>
+        <w:ind w:left="720" w:hanging="360"/>
+      </w:pPr>
+      <w:rPr>
+        <w:rFonts w:hint="default" w:ascii="Symbol" w:hAnsi="Symbol"/>
+      </w:rPr>
+    </w:lvl>
+    <w:lvl xmlns:w="http://schemas.openxmlformats.org/wordprocessingml/2006/main" w:ilvl="1">
+      <w:start w:val="1"/>
+      <w:numFmt w:val="bullet"/>
+      <w:lvlText w:val="o"/>
+      <w:lvlJc w:val="left"/>
+      <w:pPr>
+        <w:ind w:left="1440" w:hanging="360"/>
+      </w:pPr>
+      <w:rPr>
+        <w:rFonts w:hint="default" w:ascii="Courier New" w:hAnsi="Courier New"/>
+      </w:rPr>
+    </w:lvl>
+    <w:lvl xmlns:w="http://schemas.openxmlformats.org/wordprocessingml/2006/main" w:ilvl="2">
+      <w:start w:val="1"/>
+      <w:numFmt w:val="bullet"/>
+      <w:lvlText w:val=""/>
+      <w:lvlJc w:val="left"/>
+      <w:pPr>
+        <w:ind w:left="2160" w:hanging="360"/>
+      </w:pPr>
+      <w:rPr>
+        <w:rFonts w:hint="default" w:ascii="Wingdings" w:hAnsi="Wingdings"/>
+      </w:rPr>
+    </w:lvl>
+    <w:lvl xmlns:w="http://schemas.openxmlformats.org/wordprocessingml/2006/main" w:ilvl="3">
+      <w:start w:val="1"/>
+      <w:numFmt w:val="bullet"/>
+      <w:lvlText w:val=""/>
+      <w:lvlJc w:val="left"/>
+      <w:pPr>
+        <w:ind w:left="2880" w:hanging="360"/>
+      </w:pPr>
+      <w:rPr>
+        <w:rFonts w:hint="default" w:ascii="Symbol" w:hAnsi="Symbol"/>
+      </w:rPr>
+    </w:lvl>
+    <w:lvl xmlns:w="http://schemas.openxmlformats.org/wordprocessingml/2006/main" w:ilvl="4">
+      <w:start w:val="1"/>
+      <w:numFmt w:val="bullet"/>
+      <w:lvlText w:val="o"/>
+      <w:lvlJc w:val="left"/>
+      <w:pPr>
+        <w:ind w:left="3600" w:hanging="360"/>
+      </w:pPr>
+      <w:rPr>
+        <w:rFonts w:hint="default" w:ascii="Courier New" w:hAnsi="Courier New"/>
+      </w:rPr>
+    </w:lvl>
+    <w:lvl xmlns:w="http://schemas.openxmlformats.org/wordprocessingml/2006/main" w:ilvl="5">
+      <w:start w:val="1"/>
+      <w:numFmt w:val="bullet"/>
+      <w:lvlText w:val=""/>
+      <w:lvlJc w:val="left"/>
+      <w:pPr>
+        <w:ind w:left="4320" w:hanging="360"/>
+      </w:pPr>
+      <w:rPr>
+        <w:rFonts w:hint="default" w:ascii="Wingdings" w:hAnsi="Wingdings"/>
+      </w:rPr>
+    </w:lvl>
+    <w:lvl xmlns:w="http://schemas.openxmlformats.org/wordprocessingml/2006/main" w:ilvl="6">
+      <w:start w:val="1"/>
+      <w:numFmt w:val="bullet"/>
+      <w:lvlText w:val=""/>
+      <w:lvlJc w:val="left"/>
+      <w:pPr>
+        <w:ind w:left="5040" w:hanging="360"/>
+      </w:pPr>
+      <w:rPr>
+        <w:rFonts w:hint="default" w:ascii="Symbol" w:hAnsi="Symbol"/>
+      </w:rPr>
+    </w:lvl>
+    <w:lvl xmlns:w="http://schemas.openxmlformats.org/wordprocessingml/2006/main" w:ilvl="7">
+      <w:start w:val="1"/>
+      <w:numFmt w:val="bullet"/>
+      <w:lvlText w:val="o"/>
+      <w:lvlJc w:val="left"/>
+      <w:pPr>
+        <w:ind w:left="5760" w:hanging="360"/>
+      </w:pPr>
+      <w:rPr>
+        <w:rFonts w:hint="default" w:ascii="Courier New" w:hAnsi="Courier New"/>
+      </w:rPr>
+    </w:lvl>
+    <w:lvl xmlns:w="http://schemas.openxmlformats.org/wordprocessingml/2006/main" w:ilvl="8">
+      <w:start w:val="1"/>
+      <w:numFmt w:val="bullet"/>
+      <w:lvlText w:val=""/>
+      <w:lvlJc w:val="left"/>
+      <w:pPr>
+        <w:ind w:left="6480" w:hanging="360"/>
+      </w:pPr>
+      <w:rPr>
+        <w:rFonts w:hint="default" w:ascii="Wingdings" w:hAnsi="Wingdings"/>
+      </w:rPr>
+    </w:lvl>
+  </w:abstractNum>
+  <w:abstractNum xmlns:w="http://schemas.openxmlformats.org/wordprocessingml/2006/main" w:abstractNumId="2">
+    <w:nsid w:val="3bb78012"/>
+    <w:multiLevelType xmlns:w="http://schemas.openxmlformats.org/wordprocessingml/2006/main" w:val="hybridMultilevel"/>
+    <w:lvl xmlns:w="http://schemas.openxmlformats.org/wordprocessingml/2006/main" w:ilvl="0">
+      <w:start w:val="1"/>
+      <w:numFmt w:val="bullet"/>
+      <w:lvlText w:val="-"/>
+      <w:lvlJc w:val="left"/>
+      <w:pPr>
+        <w:ind w:left="720" w:hanging="360"/>
+      </w:pPr>
+      <w:rPr>
+        <w:rFonts w:hint="default" w:ascii="Aptos" w:hAnsi="Aptos"/>
+      </w:rPr>
+    </w:lvl>
+    <w:lvl xmlns:w="http://schemas.openxmlformats.org/wordprocessingml/2006/main" w:ilvl="1">
+      <w:start w:val="1"/>
+      <w:numFmt w:val="bullet"/>
+      <w:lvlText w:val="o"/>
+      <w:lvlJc w:val="left"/>
+      <w:pPr>
+        <w:ind w:left="1440" w:hanging="360"/>
+      </w:pPr>
+      <w:rPr>
+        <w:rFonts w:hint="default" w:ascii="Courier New" w:hAnsi="Courier New"/>
+      </w:rPr>
+    </w:lvl>
+    <w:lvl xmlns:w="http://schemas.openxmlformats.org/wordprocessingml/2006/main" w:ilvl="2">
+      <w:start w:val="1"/>
+      <w:numFmt w:val="bullet"/>
+      <w:lvlText w:val=""/>
+      <w:lvlJc w:val="left"/>
+      <w:pPr>
+        <w:ind w:left="2160" w:hanging="360"/>
+      </w:pPr>
+      <w:rPr>
+        <w:rFonts w:hint="default" w:ascii="Wingdings" w:hAnsi="Wingdings"/>
+      </w:rPr>
+    </w:lvl>
+    <w:lvl xmlns:w="http://schemas.openxmlformats.org/wordprocessingml/2006/main" w:ilvl="3">
+      <w:start w:val="1"/>
+      <w:numFmt w:val="bullet"/>
+      <w:lvlText w:val=""/>
+      <w:lvlJc w:val="left"/>
+      <w:pPr>
+        <w:ind w:left="2880" w:hanging="360"/>
+      </w:pPr>
+      <w:rPr>
+        <w:rFonts w:hint="default" w:ascii="Symbol" w:hAnsi="Symbol"/>
+      </w:rPr>
+    </w:lvl>
+    <w:lvl xmlns:w="http://schemas.openxmlformats.org/wordprocessingml/2006/main" w:ilvl="4">
+      <w:start w:val="1"/>
+      <w:numFmt w:val="bullet"/>
+      <w:lvlText w:val="o"/>
+      <w:lvlJc w:val="left"/>
+      <w:pPr>
+        <w:ind w:left="3600" w:hanging="360"/>
+      </w:pPr>
+      <w:rPr>
+        <w:rFonts w:hint="default" w:ascii="Courier New" w:hAnsi="Courier New"/>
+      </w:rPr>
+    </w:lvl>
+    <w:lvl xmlns:w="http://schemas.openxmlformats.org/wordprocessingml/2006/main" w:ilvl="5">
+      <w:start w:val="1"/>
+      <w:numFmt w:val="bullet"/>
+      <w:lvlText w:val=""/>
+      <w:lvlJc w:val="left"/>
+      <w:pPr>
+        <w:ind w:left="4320" w:hanging="360"/>
+      </w:pPr>
+      <w:rPr>
+        <w:rFonts w:hint="default" w:ascii="Wingdings" w:hAnsi="Wingdings"/>
+      </w:rPr>
+    </w:lvl>
+    <w:lvl xmlns:w="http://schemas.openxmlformats.org/wordprocessingml/2006/main" w:ilvl="6">
+      <w:start w:val="1"/>
+      <w:numFmt w:val="bullet"/>
+      <w:lvlText w:val=""/>
+      <w:lvlJc w:val="left"/>
+      <w:pPr>
+        <w:ind w:left="5040" w:hanging="360"/>
+      </w:pPr>
+      <w:rPr>
+        <w:rFonts w:hint="default" w:ascii="Symbol" w:hAnsi="Symbol"/>
+      </w:rPr>
+    </w:lvl>
+    <w:lvl xmlns:w="http://schemas.openxmlformats.org/wordprocessingml/2006/main" w:ilvl="7">
+      <w:start w:val="1"/>
+      <w:numFmt w:val="bullet"/>
+      <w:lvlText w:val="o"/>
+      <w:lvlJc w:val="left"/>
+      <w:pPr>
+        <w:ind w:left="5760" w:hanging="360"/>
+      </w:pPr>
+      <w:rPr>
+        <w:rFonts w:hint="default" w:ascii="Courier New" w:hAnsi="Courier New"/>
+      </w:rPr>
+    </w:lvl>
+    <w:lvl xmlns:w="http://schemas.openxmlformats.org/wordprocessingml/2006/main" w:ilvl="8">
+      <w:start w:val="1"/>
+      <w:numFmt w:val="bullet"/>
+      <w:lvlText w:val=""/>
+      <w:lvlJc w:val="left"/>
+      <w:pPr>
+        <w:ind w:left="6480" w:hanging="360"/>
+      </w:pPr>
+      <w:rPr>
+        <w:rFonts w:hint="default" w:ascii="Wingdings" w:hAnsi="Wingdings"/>
+      </w:rPr>
+    </w:lvl>
+  </w:abstractNum>
+  <w:abstractNum xmlns:w="http://schemas.openxmlformats.org/wordprocessingml/2006/main" w:abstractNumId="1">
+    <w:nsid w:val="2027147e"/>
+    <w:multiLevelType xmlns:w="http://schemas.openxmlformats.org/wordprocessingml/2006/main" w:val="hybridMultilevel"/>
+    <w:lvl xmlns:w="http://schemas.openxmlformats.org/wordprocessingml/2006/main" w:ilvl="0">
+      <w:start w:val="1"/>
+      <w:numFmt w:val="bullet"/>
+      <w:lvlText w:val="-"/>
+      <w:lvlJc w:val="left"/>
+      <w:pPr>
+        <w:ind w:left="720" w:hanging="360"/>
+      </w:pPr>
+      <w:rPr>
+        <w:rFonts w:hint="default" w:ascii="Aptos" w:hAnsi="Aptos"/>
+      </w:rPr>
+    </w:lvl>
+    <w:lvl xmlns:w="http://schemas.openxmlformats.org/wordprocessingml/2006/main" w:ilvl="1">
+      <w:start w:val="1"/>
+      <w:numFmt w:val="bullet"/>
+      <w:lvlText w:val="o"/>
+      <w:lvlJc w:val="left"/>
+      <w:pPr>
+        <w:ind w:left="1440" w:hanging="360"/>
+      </w:pPr>
+      <w:rPr>
+        <w:rFonts w:hint="default" w:ascii="Courier New" w:hAnsi="Courier New"/>
+      </w:rPr>
+    </w:lvl>
+    <w:lvl xmlns:w="http://schemas.openxmlformats.org/wordprocessingml/2006/main" w:ilvl="2">
+      <w:start w:val="1"/>
+      <w:numFmt w:val="bullet"/>
+      <w:lvlText w:val=""/>
+      <w:lvlJc w:val="left"/>
+      <w:pPr>
+        <w:ind w:left="2160" w:hanging="360"/>
+      </w:pPr>
+      <w:rPr>
+        <w:rFonts w:hint="default" w:ascii="Wingdings" w:hAnsi="Wingdings"/>
+      </w:rPr>
+    </w:lvl>
+    <w:lvl xmlns:w="http://schemas.openxmlformats.org/wordprocessingml/2006/main" w:ilvl="3">
+      <w:start w:val="1"/>
+      <w:numFmt w:val="bullet"/>
+      <w:lvlText w:val=""/>
+      <w:lvlJc w:val="left"/>
+      <w:pPr>
+        <w:ind w:left="2880" w:hanging="360"/>
+      </w:pPr>
+      <w:rPr>
+        <w:rFonts w:hint="default" w:ascii="Symbol" w:hAnsi="Symbol"/>
+      </w:rPr>
+    </w:lvl>
+    <w:lvl xmlns:w="http://schemas.openxmlformats.org/wordprocessingml/2006/main" w:ilvl="4">
+      <w:start w:val="1"/>
+      <w:numFmt w:val="bullet"/>
+      <w:lvlText w:val="o"/>
+      <w:lvlJc w:val="left"/>
+      <w:pPr>
+        <w:ind w:left="3600" w:hanging="360"/>
+      </w:pPr>
+      <w:rPr>
+        <w:rFonts w:hint="default" w:ascii="Courier New" w:hAnsi="Courier New"/>
+      </w:rPr>
+    </w:lvl>
+    <w:lvl xmlns:w="http://schemas.openxmlformats.org/wordprocessingml/2006/main" w:ilvl="5">
+      <w:start w:val="1"/>
+      <w:numFmt w:val="bullet"/>
+      <w:lvlText w:val=""/>
+      <w:lvlJc w:val="left"/>
+      <w:pPr>
+        <w:ind w:left="4320" w:hanging="360"/>
+      </w:pPr>
+      <w:rPr>
+        <w:rFonts w:hint="default" w:ascii="Wingdings" w:hAnsi="Wingdings"/>
+      </w:rPr>
+    </w:lvl>
+    <w:lvl xmlns:w="http://schemas.openxmlformats.org/wordprocessingml/2006/main" w:ilvl="6">
+      <w:start w:val="1"/>
+      <w:numFmt w:val="bullet"/>
+      <w:lvlText w:val=""/>
+      <w:lvlJc w:val="left"/>
+      <w:pPr>
+        <w:ind w:left="5040" w:hanging="360"/>
+      </w:pPr>
+      <w:rPr>
+        <w:rFonts w:hint="default" w:ascii="Symbol" w:hAnsi="Symbol"/>
+      </w:rPr>
+    </w:lvl>
+    <w:lvl xmlns:w="http://schemas.openxmlformats.org/wordprocessingml/2006/main" w:ilvl="7">
+      <w:start w:val="1"/>
+      <w:numFmt w:val="bullet"/>
+      <w:lvlText w:val="o"/>
+      <w:lvlJc w:val="left"/>
+      <w:pPr>
+        <w:ind w:left="5760" w:hanging="360"/>
+      </w:pPr>
+      <w:rPr>
+        <w:rFonts w:hint="default" w:ascii="Courier New" w:hAnsi="Courier New"/>
+      </w:rPr>
+    </w:lvl>
+    <w:lvl xmlns:w="http://schemas.openxmlformats.org/wordprocessingml/2006/main" w:ilvl="8">
+      <w:start w:val="1"/>
+      <w:numFmt w:val="bullet"/>
+      <w:lvlText w:val=""/>
+      <w:lvlJc w:val="left"/>
+      <w:pPr>
+        <w:ind w:left="6480" w:hanging="360"/>
+      </w:pPr>
+      <w:rPr>
+        <w:rFonts w:hint="default" w:ascii="Wingdings" w:hAnsi="Wingdings"/>
+      </w:rPr>
+    </w:lvl>
+  </w:abstractNum>
+  <w:num w:numId="3">
+    <w:abstractNumId w:val="3"/>
+  </w:num>
+  <w:num w:numId="2">
+    <w:abstractNumId w:val="2"/>
+  </w:num>
+  <w:num w:numId="1">
+    <w:abstractNumId w:val="1"/>
+  </w:num>
+</w:numbering>
 </file>
 
 <file path=word/styles.xml><?xml version="1.0" encoding="utf-8"?>
@@ -1440,6 +3075,18 @@
     <w:semiHidden/>
     <w:unhideWhenUsed/>
   </w:style>
+  <w:style w:type="paragraph" w:styleId="ListParagraph">
+    <w:uiPriority w:val="34"/>
+    <w:name w:val="List Paragraph"/>
+    <w:basedOn w:val="Normal"/>
+    <w:qFormat/>
+    <w:rsid w:val="4C5B4D1A"/>
+    <w:pPr>
+      <w:spacing/>
+      <w:ind w:left="720"/>
+      <w:contextualSpacing/>
+    </w:pPr>
+  </w:style>
 </w:styles>
 </file>
 

</xml_diff>